<commit_message>
Module 04: add a Part 0 setup cell to the RAG mini-project starter
The starter assumed its packages were installed and that it ran from its
own folder, which fails on Colab. The new first cell mounts Drive, clones
the course repository, installs 04_RAG/requirements.txt and changes into
the notebook's folder on Colab; elsewhere it loads .env. It then checks
the course files can be found. No TODO blanks are touched and the
notebook stays unexecuted. The setup guide now says to run the cell
rather than paste it.

Co-Authored-By: Claude Opus 5.5 <noreply@anthropic.com>
</commit_message>
<xml_diff>
--- a/04_RAG/assignments/project/Setup_Guide.docx
+++ b/04_RAG/assignments/project/Setup_Guide.docx
@@ -1380,7 +1380,19 @@
         <w:rPr>
           <w:b w:val="0"/>
         </w:rPr>
-        <w:t>Add the setup cell from step 5 as the first cell, and run it.</w:t>
+        <w:t xml:space="preserve">Run the </w:t>
+      </w:r>
+      <w:r>
+        <w:rPr>
+          <w:b/>
+        </w:rPr>
+        <w:t>Part 0 — Setup</w:t>
+      </w:r>
+      <w:r>
+        <w:rPr>
+          <w:b w:val="0"/>
+        </w:rPr>
+        <w:t xml:space="preserve"> cell at the top of the notebook (step 5).</w:t>
       </w:r>
     </w:p>
     <w:tbl>
@@ -2504,7 +2516,7 @@
         <w:rPr>
           <w:b w:val="0"/>
         </w:rPr>
-        <w:t>5. Add the setup cell</w:t>
+        <w:t>5. Run the setup cell</w:t>
       </w:r>
     </w:p>
     <w:p>
@@ -2512,31 +2524,19 @@
         <w:rPr>
           <w:b w:val="0"/>
         </w:rPr>
-        <w:t xml:space="preserve">Paste this in as the </w:t>
+        <w:t xml:space="preserve">The notebook starts with this cell, under </w:t>
       </w:r>
       <w:r>
         <w:rPr>
           <w:b/>
         </w:rPr>
-        <w:t>first cell</w:t>
+        <w:t>Part 0 — Setup</w:t>
       </w:r>
       <w:r>
         <w:rPr>
           <w:b w:val="0"/>
         </w:rPr>
-        <w:t xml:space="preserve"> of the notebook (select the top cell, then </w:t>
-      </w:r>
-      <w:r>
-        <w:rPr>
-          <w:b/>
-        </w:rPr>
-        <w:t>Insert → Code cell</w:t>
-      </w:r>
-      <w:r>
-        <w:rPr>
-          <w:b w:val="0"/>
-        </w:rPr>
-        <w:t xml:space="preserve"> above it) and run it every time you open the notebook. On Colab it mounts your Drive, installs the packages, moves into the notebook's folder, and reads your API key from Colab Secrets. On Jetstream2 or your own computer it reads your key from </w:t>
+        <w:t xml:space="preserve">. Run it every time you open the notebook. On Colab it mounts your Drive, installs the packages, moves into the notebook's folder, and reads your API key from Colab Secrets. On Jetstream2 or your own computer it reads your key from </w:t>
       </w:r>
       <w:r>
         <w:rPr>

</xml_diff>

<commit_message>
Module 04: remove the Part 0 setup cell from the RAG starter
The starter's existing commented pip line covers every package it imports,
so students uncomment that instead. The setup guide goes back to offering
the setup cell as an optional paste-in.

Co-Authored-By: Claude Opus 5.5 <noreply@anthropic.com>
</commit_message>
<xml_diff>
--- a/04_RAG/assignments/project/Setup_Guide.docx
+++ b/04_RAG/assignments/project/Setup_Guide.docx
@@ -1380,19 +1380,7 @@
         <w:rPr>
           <w:b w:val="0"/>
         </w:rPr>
-        <w:t xml:space="preserve">Run the </w:t>
-      </w:r>
-      <w:r>
-        <w:rPr>
-          <w:b/>
-        </w:rPr>
-        <w:t>Part 0 — Setup</w:t>
-      </w:r>
-      <w:r>
-        <w:rPr>
-          <w:b w:val="0"/>
-        </w:rPr>
-        <w:t xml:space="preserve"> cell at the top of the notebook (step 5).</w:t>
+        <w:t>Add the setup cell from step 5 as the first cell, and run it.</w:t>
       </w:r>
     </w:p>
     <w:tbl>
@@ -2516,7 +2504,7 @@
         <w:rPr>
           <w:b w:val="0"/>
         </w:rPr>
-        <w:t>5. Run the setup cell</w:t>
+        <w:t>5. Add the setup cell</w:t>
       </w:r>
     </w:p>
     <w:p>
@@ -2524,19 +2512,31 @@
         <w:rPr>
           <w:b w:val="0"/>
         </w:rPr>
-        <w:t xml:space="preserve">The notebook starts with this cell, under </w:t>
+        <w:t xml:space="preserve">Paste this in as the </w:t>
       </w:r>
       <w:r>
         <w:rPr>
           <w:b/>
         </w:rPr>
-        <w:t>Part 0 — Setup</w:t>
+        <w:t>first cell</w:t>
       </w:r>
       <w:r>
         <w:rPr>
           <w:b w:val="0"/>
         </w:rPr>
-        <w:t xml:space="preserve">. Run it every time you open the notebook. On Colab it mounts your Drive, installs the packages, moves into the notebook's folder, and reads your API key from Colab Secrets. On Jetstream2 or your own computer it reads your key from </w:t>
+        <w:t xml:space="preserve"> of the notebook (select the top cell, then </w:t>
+      </w:r>
+      <w:r>
+        <w:rPr>
+          <w:b/>
+        </w:rPr>
+        <w:t>Insert → Code cell</w:t>
+      </w:r>
+      <w:r>
+        <w:rPr>
+          <w:b w:val="0"/>
+        </w:rPr>
+        <w:t xml:space="preserve"> above it) and run it every time you open the notebook. On Colab it mounts your Drive, installs the packages, moves into the notebook's folder, and reads your API key from Colab Secrets. On Jetstream2 or your own computer it reads your key from </w:t>
       </w:r>
       <w:r>
         <w:rPr>

</xml_diff>

<commit_message>
Module 04: simplify the setup guide to three steps
Get the code, uncomment the starter's pip line, run the notebook. Drops the
setup cell, whole-course install, torch/CUDA notes, repository tree and
submission steps. Keeps the two-line %cd cell Colab needs to find the
notebook's files, and a short troubleshooting table.

Co-Authored-By: Claude Opus 5.5 <noreply@anthropic.com>
</commit_message>
<xml_diff>
--- a/04_RAG/assignments/project/Setup_Guide.docx
+++ b/04_RAG/assignments/project/Setup_Guide.docx
@@ -35,7 +35,7 @@
               <w:spacing w:before="0" w:after="80"/>
             </w:pPr>
             <w:r>
-              <w:t>Getting Started with the Course Notebooks</w:t>
+              <w:t>Getting Started with the Mini Project</w:t>
             </w:r>
           </w:p>
           <w:p>
@@ -48,381 +48,7 @@
                 <w:color w:val="E6EBF1"/>
                 <w:sz w:val="22"/>
               </w:rPr>
-              <w:t>Module 04: Retrieval-Augmented Generation (RAG) · Clone the repository, open the notebook, and install every package on Google Colab, Jetstream2, or your own computer.</w:t>
-            </w:r>
-          </w:p>
-        </w:tc>
-      </w:tr>
-    </w:tbl>
-    <w:p>
-      <w:pPr>
-        <w:spacing w:before="0" w:after="40"/>
-      </w:pPr>
-    </w:p>
-    <w:p>
-      <w:r>
-        <w:rPr>
-          <w:b w:val="0"/>
-        </w:rPr>
-        <w:t>Every notebook in this course lives in one GitHub repository. To run one you need three things: a copy of the repository, a place to run the notebook, and the Python packages it imports. This guide covers all three. It also covers the one check that prevents the most common problem: a notebook that cannot find its files.</w:t>
-      </w:r>
-    </w:p>
-    <w:p>
-      <w:pPr>
-        <w:keepNext/>
-        <w:spacing w:before="160" w:after="60"/>
-      </w:pPr>
-      <w:r>
-        <w:rPr>
-          <w:b/>
-        </w:rPr>
-        <w:t>Module 04 at a glance</w:t>
-      </w:r>
-    </w:p>
-    <w:tbl>
-      <w:tblPr>
-        <w:tblW w:type="auto" w:w="0"/>
-        <w:jc w:val="center"/>
-        <w:tblLook w:firstColumn="1" w:firstRow="1" w:lastColumn="0" w:lastRow="0" w:noHBand="0" w:noVBand="1" w:val="04A0"/>
-      </w:tblPr>
-      <w:tblGrid>
-        <w:gridCol w:w="4896"/>
-        <w:gridCol w:w="4896"/>
-      </w:tblGrid>
-      <w:tr>
-        <w:tc>
-          <w:tcPr>
-            <w:tcW w:type="dxa" w:w="2350"/>
-            <w:tcBorders>
-              <w:top w:val="single" w:sz="4" w:color="C9D2DC"/>
-              <w:left w:val="single" w:sz="4" w:color="C9D2DC"/>
-              <w:bottom w:val="single" w:sz="4" w:color="C9D2DC"/>
-              <w:right w:val="single" w:sz="4" w:color="C9D2DC"/>
-            </w:tcBorders>
-            <w:tcMar>
-              <w:top w:w="60" w:type="dxa"/>
-              <w:bottom w:w="60" w:type="dxa"/>
-              <w:left w:w="110" w:type="dxa"/>
-              <w:right w:w="110" w:type="dxa"/>
-            </w:tcMar>
-            <w:shd w:val="clear" w:color="auto" w:fill="0D1B2A"/>
-          </w:tcPr>
-          <w:p>
-            <w:pPr>
-              <w:spacing w:before="0" w:after="0"/>
-            </w:pPr>
-            <w:r>
-              <w:rPr>
-                <w:b/>
-                <w:color w:val="FFFFFF"/>
-              </w:rPr>
-              <w:t>Notebook</w:t>
-            </w:r>
-          </w:p>
-        </w:tc>
-        <w:tc>
-          <w:tcPr>
-            <w:tcW w:type="dxa" w:w="7442"/>
-            <w:tcBorders>
-              <w:top w:val="single" w:sz="4" w:color="C9D2DC"/>
-              <w:left w:val="single" w:sz="4" w:color="C9D2DC"/>
-              <w:bottom w:val="single" w:sz="4" w:color="C9D2DC"/>
-              <w:right w:val="single" w:sz="4" w:color="C9D2DC"/>
-            </w:tcBorders>
-            <w:tcMar>
-              <w:top w:w="60" w:type="dxa"/>
-              <w:bottom w:w="60" w:type="dxa"/>
-              <w:left w:w="110" w:type="dxa"/>
-              <w:right w:w="110" w:type="dxa"/>
-            </w:tcMar>
-            <w:shd w:val="clear" w:color="auto" w:fill="F3F5F7"/>
-          </w:tcPr>
-          <w:p>
-            <w:pPr>
-              <w:spacing w:before="0" w:after="0"/>
-            </w:pPr>
-            <w:r>
-              <w:rPr>
-                <w:rFonts w:ascii="Consolas" w:hAnsi="Consolas"/>
-                <w:b w:val="0"/>
-                <w:sz w:val="19"/>
-                <w:shd w:val="clear" w:color="auto" w:fill="E8ECF0"/>
-              </w:rPr>
-              <w:t>04_RAG/assignments/project/MiniProject_RAG_Starter.ipynb</w:t>
-            </w:r>
-          </w:p>
-        </w:tc>
-      </w:tr>
-      <w:tr>
-        <w:tc>
-          <w:tcPr>
-            <w:tcW w:type="dxa" w:w="2350"/>
-            <w:tcBorders>
-              <w:top w:val="single" w:sz="4" w:color="C9D2DC"/>
-              <w:left w:val="single" w:sz="4" w:color="C9D2DC"/>
-              <w:bottom w:val="single" w:sz="4" w:color="C9D2DC"/>
-              <w:right w:val="single" w:sz="4" w:color="C9D2DC"/>
-            </w:tcBorders>
-            <w:tcMar>
-              <w:top w:w="60" w:type="dxa"/>
-              <w:bottom w:w="60" w:type="dxa"/>
-              <w:left w:w="110" w:type="dxa"/>
-              <w:right w:w="110" w:type="dxa"/>
-            </w:tcMar>
-            <w:shd w:val="clear" w:color="auto" w:fill="0D1B2A"/>
-          </w:tcPr>
-          <w:p>
-            <w:pPr>
-              <w:spacing w:before="0" w:after="0"/>
-            </w:pPr>
-            <w:r>
-              <w:rPr>
-                <w:b/>
-                <w:color w:val="FFFFFF"/>
-              </w:rPr>
-              <w:t>Package list</w:t>
-            </w:r>
-          </w:p>
-        </w:tc>
-        <w:tc>
-          <w:tcPr>
-            <w:tcW w:type="dxa" w:w="7442"/>
-            <w:tcBorders>
-              <w:top w:val="single" w:sz="4" w:color="C9D2DC"/>
-              <w:left w:val="single" w:sz="4" w:color="C9D2DC"/>
-              <w:bottom w:val="single" w:sz="4" w:color="C9D2DC"/>
-              <w:right w:val="single" w:sz="4" w:color="C9D2DC"/>
-            </w:tcBorders>
-            <w:tcMar>
-              <w:top w:w="60" w:type="dxa"/>
-              <w:bottom w:w="60" w:type="dxa"/>
-              <w:left w:w="110" w:type="dxa"/>
-              <w:right w:w="110" w:type="dxa"/>
-            </w:tcMar>
-            <w:shd w:val="clear" w:color="auto" w:fill="F3F5F7"/>
-          </w:tcPr>
-          <w:p>
-            <w:pPr>
-              <w:spacing w:before="0" w:after="0"/>
-            </w:pPr>
-            <w:r>
-              <w:rPr>
-                <w:rFonts w:ascii="Consolas" w:hAnsi="Consolas"/>
-                <w:b w:val="0"/>
-                <w:sz w:val="19"/>
-                <w:shd w:val="clear" w:color="auto" w:fill="E8ECF0"/>
-              </w:rPr>
-              <w:t>04_RAG/requirements.txt</w:t>
-            </w:r>
-          </w:p>
-        </w:tc>
-      </w:tr>
-      <w:tr>
-        <w:tc>
-          <w:tcPr>
-            <w:tcW w:type="dxa" w:w="2350"/>
-            <w:tcBorders>
-              <w:top w:val="single" w:sz="4" w:color="C9D2DC"/>
-              <w:left w:val="single" w:sz="4" w:color="C9D2DC"/>
-              <w:bottom w:val="single" w:sz="4" w:color="C9D2DC"/>
-              <w:right w:val="single" w:sz="4" w:color="C9D2DC"/>
-            </w:tcBorders>
-            <w:tcMar>
-              <w:top w:w="60" w:type="dxa"/>
-              <w:bottom w:w="60" w:type="dxa"/>
-              <w:left w:w="110" w:type="dxa"/>
-              <w:right w:w="110" w:type="dxa"/>
-            </w:tcMar>
-            <w:shd w:val="clear" w:color="auto" w:fill="0D1B2A"/>
-          </w:tcPr>
-          <w:p>
-            <w:pPr>
-              <w:spacing w:before="0" w:after="0"/>
-            </w:pPr>
-            <w:r>
-              <w:rPr>
-                <w:b/>
-                <w:color w:val="FFFFFF"/>
-              </w:rPr>
-              <w:t>Files it reads</w:t>
-            </w:r>
-          </w:p>
-        </w:tc>
-        <w:tc>
-          <w:tcPr>
-            <w:tcW w:type="dxa" w:w="7442"/>
-            <w:tcBorders>
-              <w:top w:val="single" w:sz="4" w:color="C9D2DC"/>
-              <w:left w:val="single" w:sz="4" w:color="C9D2DC"/>
-              <w:bottom w:val="single" w:sz="4" w:color="C9D2DC"/>
-              <w:right w:val="single" w:sz="4" w:color="C9D2DC"/>
-            </w:tcBorders>
-            <w:tcMar>
-              <w:top w:w="60" w:type="dxa"/>
-              <w:bottom w:w="60" w:type="dxa"/>
-              <w:left w:w="110" w:type="dxa"/>
-              <w:right w:w="110" w:type="dxa"/>
-            </w:tcMar>
-            <w:shd w:val="clear" w:color="auto" w:fill="F3F5F7"/>
-          </w:tcPr>
-          <w:p>
-            <w:pPr>
-              <w:spacing w:before="0" w:after="0"/>
-            </w:pPr>
-            <w:r>
-              <w:rPr>
-                <w:rFonts w:ascii="Consolas" w:hAnsi="Consolas"/>
-                <w:b w:val="0"/>
-                <w:sz w:val="19"/>
-                <w:shd w:val="clear" w:color="auto" w:fill="E8ECF0"/>
-              </w:rPr>
-              <w:t>04_RAG/code/ssrf.txt</w:t>
-            </w:r>
-            <w:r>
-              <w:br/>
-            </w:r>
-            <w:r>
-              <w:rPr>
-                <w:rFonts w:ascii="Consolas" w:hAnsi="Consolas"/>
-                <w:b w:val="0"/>
-                <w:sz w:val="19"/>
-                <w:shd w:val="clear" w:color="auto" w:fill="E8ECF0"/>
-              </w:rPr>
-              <w:t>04_RAG/code/cybersecurity_kb.md</w:t>
-            </w:r>
-            <w:r>
-              <w:br/>
-            </w:r>
-            <w:r>
-              <w:rPr>
-                <w:rFonts w:ascii="Consolas" w:hAnsi="Consolas"/>
-                <w:b w:val="0"/>
-                <w:sz w:val="19"/>
-                <w:shd w:val="clear" w:color="auto" w:fill="E8ECF0"/>
-              </w:rPr>
-              <w:t>04_RAG/assignments/project/baseline_goldset.json</w:t>
-            </w:r>
-          </w:p>
-        </w:tc>
-      </w:tr>
-      <w:tr>
-        <w:tc>
-          <w:tcPr>
-            <w:tcW w:type="dxa" w:w="2350"/>
-            <w:tcBorders>
-              <w:top w:val="single" w:sz="4" w:color="C9D2DC"/>
-              <w:left w:val="single" w:sz="4" w:color="C9D2DC"/>
-              <w:bottom w:val="single" w:sz="4" w:color="C9D2DC"/>
-              <w:right w:val="single" w:sz="4" w:color="C9D2DC"/>
-            </w:tcBorders>
-            <w:tcMar>
-              <w:top w:w="60" w:type="dxa"/>
-              <w:bottom w:w="60" w:type="dxa"/>
-              <w:left w:w="110" w:type="dxa"/>
-              <w:right w:w="110" w:type="dxa"/>
-            </w:tcMar>
-            <w:shd w:val="clear" w:color="auto" w:fill="0D1B2A"/>
-          </w:tcPr>
-          <w:p>
-            <w:pPr>
-              <w:spacing w:before="0" w:after="0"/>
-            </w:pPr>
-            <w:r>
-              <w:rPr>
-                <w:b/>
-                <w:color w:val="FFFFFF"/>
-              </w:rPr>
-              <w:t>API key</w:t>
-            </w:r>
-          </w:p>
-        </w:tc>
-        <w:tc>
-          <w:tcPr>
-            <w:tcW w:type="dxa" w:w="7442"/>
-            <w:tcBorders>
-              <w:top w:val="single" w:sz="4" w:color="C9D2DC"/>
-              <w:left w:val="single" w:sz="4" w:color="C9D2DC"/>
-              <w:bottom w:val="single" w:sz="4" w:color="C9D2DC"/>
-              <w:right w:val="single" w:sz="4" w:color="C9D2DC"/>
-            </w:tcBorders>
-            <w:tcMar>
-              <w:top w:w="60" w:type="dxa"/>
-              <w:bottom w:w="60" w:type="dxa"/>
-              <w:left w:w="110" w:type="dxa"/>
-              <w:right w:w="110" w:type="dxa"/>
-            </w:tcMar>
-            <w:shd w:val="clear" w:color="auto" w:fill="F3F5F7"/>
-          </w:tcPr>
-          <w:p>
-            <w:pPr>
-              <w:spacing w:before="0" w:after="0"/>
-            </w:pPr>
-            <w:r>
-              <w:rPr>
-                <w:b w:val="0"/>
-              </w:rPr>
-              <w:t>Optional. Without one, the generate step prints an offline answer and everything else runs normally.</w:t>
-            </w:r>
-          </w:p>
-        </w:tc>
-      </w:tr>
-      <w:tr>
-        <w:tc>
-          <w:tcPr>
-            <w:tcW w:type="dxa" w:w="2350"/>
-            <w:tcBorders>
-              <w:top w:val="single" w:sz="4" w:color="C9D2DC"/>
-              <w:left w:val="single" w:sz="4" w:color="C9D2DC"/>
-              <w:bottom w:val="single" w:sz="4" w:color="C9D2DC"/>
-              <w:right w:val="single" w:sz="4" w:color="C9D2DC"/>
-            </w:tcBorders>
-            <w:tcMar>
-              <w:top w:w="60" w:type="dxa"/>
-              <w:bottom w:w="60" w:type="dxa"/>
-              <w:left w:w="110" w:type="dxa"/>
-              <w:right w:w="110" w:type="dxa"/>
-            </w:tcMar>
-            <w:shd w:val="clear" w:color="auto" w:fill="0D1B2A"/>
-          </w:tcPr>
-          <w:p>
-            <w:pPr>
-              <w:spacing w:before="0" w:after="0"/>
-            </w:pPr>
-            <w:r>
-              <w:rPr>
-                <w:b/>
-                <w:color w:val="FFFFFF"/>
-              </w:rPr>
-              <w:t>GPU</w:t>
-            </w:r>
-          </w:p>
-        </w:tc>
-        <w:tc>
-          <w:tcPr>
-            <w:tcW w:type="dxa" w:w="7442"/>
-            <w:tcBorders>
-              <w:top w:val="single" w:sz="4" w:color="C9D2DC"/>
-              <w:left w:val="single" w:sz="4" w:color="C9D2DC"/>
-              <w:bottom w:val="single" w:sz="4" w:color="C9D2DC"/>
-              <w:right w:val="single" w:sz="4" w:color="C9D2DC"/>
-            </w:tcBorders>
-            <w:tcMar>
-              <w:top w:w="60" w:type="dxa"/>
-              <w:bottom w:w="60" w:type="dxa"/>
-              <w:left w:w="110" w:type="dxa"/>
-              <w:right w:w="110" w:type="dxa"/>
-            </w:tcMar>
-            <w:shd w:val="clear" w:color="auto" w:fill="F3F5F7"/>
-          </w:tcPr>
-          <w:p>
-            <w:pPr>
-              <w:spacing w:before="0" w:after="0"/>
-            </w:pPr>
-            <w:r>
-              <w:rPr>
-                <w:b w:val="0"/>
-              </w:rPr>
-              <w:t>Not needed. The notebook runs on the CPU.</w:t>
+              <w:t>Module 04: Retrieval-Augmented Generation (RAG) · Three steps: get the code, install the packages, run the notebook.</w:t>
             </w:r>
           </w:p>
         </w:tc>
@@ -446,401 +72,7 @@
         <w:rPr>
           <w:b w:val="0"/>
         </w:rPr>
-        <w:t>1. Pick where you will work</w:t>
-      </w:r>
-    </w:p>
-    <w:tbl>
-      <w:tblPr>
-        <w:tblW w:type="auto" w:w="0"/>
-        <w:jc w:val="center"/>
-        <w:tblLook w:firstColumn="1" w:firstRow="1" w:lastColumn="0" w:lastRow="0" w:noHBand="0" w:noVBand="1" w:val="04A0"/>
-      </w:tblPr>
-      <w:tblGrid>
-        <w:gridCol w:w="3264"/>
-        <w:gridCol w:w="3264"/>
-        <w:gridCol w:w="3264"/>
-      </w:tblGrid>
-      <w:tr>
-        <w:trPr>
-          <w:tblHeader w:val="true"/>
-        </w:trPr>
-        <w:tc>
-          <w:tcPr>
-            <w:tcW w:type="dxa" w:w="2154"/>
-            <w:tcBorders>
-              <w:top w:val="single" w:sz="4" w:color="C9D2DC"/>
-              <w:left w:val="single" w:sz="4" w:color="C9D2DC"/>
-              <w:bottom w:val="single" w:sz="4" w:color="C9D2DC"/>
-              <w:right w:val="single" w:sz="4" w:color="C9D2DC"/>
-            </w:tcBorders>
-            <w:tcMar>
-              <w:top w:w="60" w:type="dxa"/>
-              <w:bottom w:w="60" w:type="dxa"/>
-              <w:left w:w="110" w:type="dxa"/>
-              <w:right w:w="110" w:type="dxa"/>
-            </w:tcMar>
-            <w:shd w:val="clear" w:color="auto" w:fill="0D1B2A"/>
-          </w:tcPr>
-          <w:p>
-            <w:pPr>
-              <w:spacing w:before="0" w:after="0"/>
-            </w:pPr>
-            <w:r>
-              <w:rPr>
-                <w:b/>
-                <w:color w:val="FFFFFF"/>
-              </w:rPr>
-              <w:t>Where</w:t>
-            </w:r>
-          </w:p>
-        </w:tc>
-        <w:tc>
-          <w:tcPr>
-            <w:tcW w:type="dxa" w:w="4504"/>
-            <w:tcBorders>
-              <w:top w:val="single" w:sz="4" w:color="C9D2DC"/>
-              <w:left w:val="single" w:sz="4" w:color="C9D2DC"/>
-              <w:bottom w:val="single" w:sz="4" w:color="C9D2DC"/>
-              <w:right w:val="single" w:sz="4" w:color="C9D2DC"/>
-            </w:tcBorders>
-            <w:tcMar>
-              <w:top w:w="60" w:type="dxa"/>
-              <w:bottom w:w="60" w:type="dxa"/>
-              <w:left w:w="110" w:type="dxa"/>
-              <w:right w:w="110" w:type="dxa"/>
-            </w:tcMar>
-            <w:shd w:val="clear" w:color="auto" w:fill="0D1B2A"/>
-          </w:tcPr>
-          <w:p>
-            <w:pPr>
-              <w:spacing w:before="0" w:after="0"/>
-            </w:pPr>
-            <w:r>
-              <w:rPr>
-                <w:b/>
-                <w:color w:val="FFFFFF"/>
-              </w:rPr>
-              <w:t>Good for</w:t>
-            </w:r>
-          </w:p>
-        </w:tc>
-        <w:tc>
-          <w:tcPr>
-            <w:tcW w:type="dxa" w:w="3133"/>
-            <w:tcBorders>
-              <w:top w:val="single" w:sz="4" w:color="C9D2DC"/>
-              <w:left w:val="single" w:sz="4" w:color="C9D2DC"/>
-              <w:bottom w:val="single" w:sz="4" w:color="C9D2DC"/>
-              <w:right w:val="single" w:sz="4" w:color="C9D2DC"/>
-            </w:tcBorders>
-            <w:tcMar>
-              <w:top w:w="60" w:type="dxa"/>
-              <w:bottom w:w="60" w:type="dxa"/>
-              <w:left w:w="110" w:type="dxa"/>
-              <w:right w:w="110" w:type="dxa"/>
-            </w:tcMar>
-            <w:shd w:val="clear" w:color="auto" w:fill="0D1B2A"/>
-          </w:tcPr>
-          <w:p>
-            <w:pPr>
-              <w:spacing w:before="0" w:after="0"/>
-            </w:pPr>
-            <w:r>
-              <w:rPr>
-                <w:b/>
-                <w:color w:val="FFFFFF"/>
-              </w:rPr>
-              <w:t>You need</w:t>
-            </w:r>
-          </w:p>
-        </w:tc>
-      </w:tr>
-      <w:tr>
-        <w:tc>
-          <w:tcPr>
-            <w:tcW w:type="dxa" w:w="2154"/>
-            <w:tcBorders>
-              <w:top w:val="single" w:sz="4" w:color="C9D2DC"/>
-              <w:left w:val="single" w:sz="4" w:color="C9D2DC"/>
-              <w:bottom w:val="single" w:sz="4" w:color="C9D2DC"/>
-              <w:right w:val="single" w:sz="4" w:color="C9D2DC"/>
-            </w:tcBorders>
-            <w:tcMar>
-              <w:top w:w="60" w:type="dxa"/>
-              <w:bottom w:w="60" w:type="dxa"/>
-              <w:left w:w="110" w:type="dxa"/>
-              <w:right w:w="110" w:type="dxa"/>
-            </w:tcMar>
-          </w:tcPr>
-          <w:p>
-            <w:pPr>
-              <w:spacing w:before="0" w:after="0"/>
-            </w:pPr>
-            <w:r>
-              <w:rPr>
-                <w:b/>
-              </w:rPr>
-              <w:t>Google Colab</w:t>
-            </w:r>
-          </w:p>
-        </w:tc>
-        <w:tc>
-          <w:tcPr>
-            <w:tcW w:type="dxa" w:w="4504"/>
-            <w:tcBorders>
-              <w:top w:val="single" w:sz="4" w:color="C9D2DC"/>
-              <w:left w:val="single" w:sz="4" w:color="C9D2DC"/>
-              <w:bottom w:val="single" w:sz="4" w:color="C9D2DC"/>
-              <w:right w:val="single" w:sz="4" w:color="C9D2DC"/>
-            </w:tcBorders>
-            <w:tcMar>
-              <w:top w:w="60" w:type="dxa"/>
-              <w:bottom w:w="60" w:type="dxa"/>
-              <w:left w:w="110" w:type="dxa"/>
-              <w:right w:w="110" w:type="dxa"/>
-            </w:tcMar>
-          </w:tcPr>
-          <w:p>
-            <w:pPr>
-              <w:spacing w:before="0" w:after="0"/>
-            </w:pPr>
-            <w:r>
-              <w:rPr>
-                <w:b w:val="0"/>
-              </w:rPr>
-              <w:t>Starting quickly, with nothing to install on your computer</w:t>
-            </w:r>
-          </w:p>
-        </w:tc>
-        <w:tc>
-          <w:tcPr>
-            <w:tcW w:type="dxa" w:w="3133"/>
-            <w:tcBorders>
-              <w:top w:val="single" w:sz="4" w:color="C9D2DC"/>
-              <w:left w:val="single" w:sz="4" w:color="C9D2DC"/>
-              <w:bottom w:val="single" w:sz="4" w:color="C9D2DC"/>
-              <w:right w:val="single" w:sz="4" w:color="C9D2DC"/>
-            </w:tcBorders>
-            <w:tcMar>
-              <w:top w:w="60" w:type="dxa"/>
-              <w:bottom w:w="60" w:type="dxa"/>
-              <w:left w:w="110" w:type="dxa"/>
-              <w:right w:w="110" w:type="dxa"/>
-            </w:tcMar>
-          </w:tcPr>
-          <w:p>
-            <w:pPr>
-              <w:spacing w:before="0" w:after="0"/>
-            </w:pPr>
-            <w:r>
-              <w:rPr>
-                <w:b w:val="0"/>
-              </w:rPr>
-              <w:t>A Google account</w:t>
-            </w:r>
-          </w:p>
-        </w:tc>
-      </w:tr>
-      <w:tr>
-        <w:tc>
-          <w:tcPr>
-            <w:tcW w:type="dxa" w:w="2154"/>
-            <w:tcBorders>
-              <w:top w:val="single" w:sz="4" w:color="C9D2DC"/>
-              <w:left w:val="single" w:sz="4" w:color="C9D2DC"/>
-              <w:bottom w:val="single" w:sz="4" w:color="C9D2DC"/>
-              <w:right w:val="single" w:sz="4" w:color="C9D2DC"/>
-            </w:tcBorders>
-            <w:tcMar>
-              <w:top w:w="60" w:type="dxa"/>
-              <w:bottom w:w="60" w:type="dxa"/>
-              <w:left w:w="110" w:type="dxa"/>
-              <w:right w:w="110" w:type="dxa"/>
-            </w:tcMar>
-          </w:tcPr>
-          <w:p>
-            <w:pPr>
-              <w:spacing w:before="0" w:after="0"/>
-            </w:pPr>
-            <w:r>
-              <w:rPr>
-                <w:b/>
-              </w:rPr>
-              <w:t>Jetstream2 VM</w:t>
-            </w:r>
-          </w:p>
-        </w:tc>
-        <w:tc>
-          <w:tcPr>
-            <w:tcW w:type="dxa" w:w="4504"/>
-            <w:tcBorders>
-              <w:top w:val="single" w:sz="4" w:color="C9D2DC"/>
-              <w:left w:val="single" w:sz="4" w:color="C9D2DC"/>
-              <w:bottom w:val="single" w:sz="4" w:color="C9D2DC"/>
-              <w:right w:val="single" w:sz="4" w:color="C9D2DC"/>
-            </w:tcBorders>
-            <w:tcMar>
-              <w:top w:w="60" w:type="dxa"/>
-              <w:bottom w:w="60" w:type="dxa"/>
-              <w:left w:w="110" w:type="dxa"/>
-              <w:right w:w="110" w:type="dxa"/>
-            </w:tcMar>
-          </w:tcPr>
-          <w:p>
-            <w:pPr>
-              <w:spacing w:before="0" w:after="0"/>
-            </w:pPr>
-            <w:r>
-              <w:rPr>
-                <w:b w:val="0"/>
-              </w:rPr>
-              <w:t>Every module, including the GPU work in Module 03</w:t>
-            </w:r>
-          </w:p>
-        </w:tc>
-        <w:tc>
-          <w:tcPr>
-            <w:tcW w:type="dxa" w:w="3133"/>
-            <w:tcBorders>
-              <w:top w:val="single" w:sz="4" w:color="C9D2DC"/>
-              <w:left w:val="single" w:sz="4" w:color="C9D2DC"/>
-              <w:bottom w:val="single" w:sz="4" w:color="C9D2DC"/>
-              <w:right w:val="single" w:sz="4" w:color="C9D2DC"/>
-            </w:tcBorders>
-            <w:tcMar>
-              <w:top w:w="60" w:type="dxa"/>
-              <w:bottom w:w="60" w:type="dxa"/>
-              <w:left w:w="110" w:type="dxa"/>
-              <w:right w:w="110" w:type="dxa"/>
-            </w:tcMar>
-          </w:tcPr>
-          <w:p>
-            <w:pPr>
-              <w:spacing w:before="0" w:after="0"/>
-            </w:pPr>
-            <w:r>
-              <w:rPr>
-                <w:b w:val="0"/>
-              </w:rPr>
-              <w:t>Your VM login (see the VM Access Guide)</w:t>
-            </w:r>
-          </w:p>
-        </w:tc>
-      </w:tr>
-      <w:tr>
-        <w:tc>
-          <w:tcPr>
-            <w:tcW w:type="dxa" w:w="2154"/>
-            <w:tcBorders>
-              <w:top w:val="single" w:sz="4" w:color="C9D2DC"/>
-              <w:left w:val="single" w:sz="4" w:color="C9D2DC"/>
-              <w:bottom w:val="single" w:sz="4" w:color="C9D2DC"/>
-              <w:right w:val="single" w:sz="4" w:color="C9D2DC"/>
-            </w:tcBorders>
-            <w:tcMar>
-              <w:top w:w="60" w:type="dxa"/>
-              <w:bottom w:w="60" w:type="dxa"/>
-              <w:left w:w="110" w:type="dxa"/>
-              <w:right w:w="110" w:type="dxa"/>
-            </w:tcMar>
-          </w:tcPr>
-          <w:p>
-            <w:pPr>
-              <w:spacing w:before="0" w:after="0"/>
-            </w:pPr>
-            <w:r>
-              <w:rPr>
-                <w:b/>
-              </w:rPr>
-              <w:t>Your own computer</w:t>
-            </w:r>
-          </w:p>
-        </w:tc>
-        <w:tc>
-          <w:tcPr>
-            <w:tcW w:type="dxa" w:w="4504"/>
-            <w:tcBorders>
-              <w:top w:val="single" w:sz="4" w:color="C9D2DC"/>
-              <w:left w:val="single" w:sz="4" w:color="C9D2DC"/>
-              <w:bottom w:val="single" w:sz="4" w:color="C9D2DC"/>
-              <w:right w:val="single" w:sz="4" w:color="C9D2DC"/>
-            </w:tcBorders>
-            <w:tcMar>
-              <w:top w:w="60" w:type="dxa"/>
-              <w:bottom w:w="60" w:type="dxa"/>
-              <w:left w:w="110" w:type="dxa"/>
-              <w:right w:w="110" w:type="dxa"/>
-            </w:tcMar>
-          </w:tcPr>
-          <w:p>
-            <w:pPr>
-              <w:spacing w:before="0" w:after="0"/>
-            </w:pPr>
-            <w:r>
-              <w:rPr>
-                <w:b w:val="0"/>
-              </w:rPr>
-              <w:t>Working offline in your own editor</w:t>
-            </w:r>
-          </w:p>
-        </w:tc>
-        <w:tc>
-          <w:tcPr>
-            <w:tcW w:type="dxa" w:w="3133"/>
-            <w:tcBorders>
-              <w:top w:val="single" w:sz="4" w:color="C9D2DC"/>
-              <w:left w:val="single" w:sz="4" w:color="C9D2DC"/>
-              <w:bottom w:val="single" w:sz="4" w:color="C9D2DC"/>
-              <w:right w:val="single" w:sz="4" w:color="C9D2DC"/>
-            </w:tcBorders>
-            <w:tcMar>
-              <w:top w:w="60" w:type="dxa"/>
-              <w:bottom w:w="60" w:type="dxa"/>
-              <w:left w:w="110" w:type="dxa"/>
-              <w:right w:w="110" w:type="dxa"/>
-            </w:tcMar>
-          </w:tcPr>
-          <w:p>
-            <w:pPr>
-              <w:spacing w:before="0" w:after="0"/>
-            </w:pPr>
-            <w:r>
-              <w:rPr>
-                <w:b w:val="0"/>
-              </w:rPr>
-              <w:t>Python 3.10 to 3.12, and Git</w:t>
-            </w:r>
-          </w:p>
-        </w:tc>
-      </w:tr>
-    </w:tbl>
-    <w:p>
-      <w:pPr>
-        <w:spacing w:before="0" w:after="40"/>
-      </w:pPr>
-    </w:p>
-    <w:p>
-      <w:r>
-        <w:rPr>
-          <w:b w:val="0"/>
-        </w:rPr>
-        <w:t>Pick one and follow its part of step 3. The notebook and your code are the same everywhere, so you can switch later.</w:t>
-      </w:r>
-    </w:p>
-    <w:p>
-      <w:pPr>
-        <w:pStyle w:val="Heading2"/>
-        <w:keepNext/>
-        <w:pBdr>
-          <w:bottom w:val="single" w:sz="18" w:space="3" w:color="A3122A"/>
-        </w:pBdr>
-        <w:spacing w:before="280" w:after="120"/>
-      </w:pPr>
-      <w:r>
-        <w:rPr>
-          <w:b w:val="0"/>
-        </w:rPr>
-        <w:t>2. Know the repository layout</w:t>
+        <w:t>1. Get the code</w:t>
       </w:r>
     </w:p>
     <w:p>
@@ -848,317 +80,7 @@
         <w:rPr>
           <w:b w:val="0"/>
         </w:rPr>
-        <w:t xml:space="preserve">The course repository is </w:t>
-      </w:r>
-      <w:hyperlink r:id="rId9">
-        <w:r>
-          <w:rPr>
-            <w:color w:val="0B4F8A"/>
-            <w:u w:val="single"/>
-          </w:rPr>
-          <w:t xml:space="preserve">github.com/li2cc/IT7075-Applied-AI-for-Cybersecurity</w:t>
-        </w:r>
-      </w:hyperlink>
-      <w:r>
-        <w:rPr>
-          <w:b w:val="0"/>
-        </w:rPr>
-        <w:t>. It is public, and you can clone it (make your own copy) but not push to it. Your submission goes in your own private repository (step 7). After cloning you will have this:</w:t>
-      </w:r>
-    </w:p>
-    <w:tbl>
-      <w:tblPr>
-        <w:tblW w:type="auto" w:w="0"/>
-        <w:jc w:val="center"/>
-        <w:tblLook w:firstColumn="1" w:firstRow="1" w:lastColumn="0" w:lastRow="0" w:noHBand="0" w:noVBand="1" w:val="04A0"/>
-      </w:tblPr>
-      <w:tblGrid>
-        <w:gridCol w:w="9792"/>
-      </w:tblGrid>
-      <w:tr>
-        <w:tc>
-          <w:tcPr>
-            <w:tcW w:type="dxa" w:w="9792"/>
-            <w:shd w:val="clear" w:color="auto" w:fill="F3F5F7"/>
-            <w:tcBorders>
-              <w:top w:val="nil"/>
-              <w:left w:val="single" w:sz="36" w:color="0D1B2A"/>
-              <w:bottom w:val="nil"/>
-              <w:right w:val="nil"/>
-            </w:tcBorders>
-            <w:tcMar>
-              <w:top w:w="120" w:type="dxa"/>
-              <w:bottom w:w="120" w:type="dxa"/>
-              <w:left w:w="200" w:type="dxa"/>
-              <w:right w:w="200" w:type="dxa"/>
-            </w:tcMar>
-          </w:tcPr>
-          <w:p>
-            <w:pPr>
-              <w:spacing w:before="0" w:after="0" w:line="240" w:lineRule="auto"/>
-            </w:pPr>
-            <w:r>
-              <w:rPr>
-                <w:rFonts w:ascii="Consolas" w:hAnsi="Consolas"/>
-                <w:sz w:val="17"/>
-              </w:rPr>
-              <w:t>IT7075/                                  &lt;- the repository (your .env goes here)</w:t>
-            </w:r>
-            <w:r>
-              <w:br/>
-            </w:r>
-            <w:r>
-              <w:rPr>
-                <w:rFonts w:ascii="Consolas" w:hAnsi="Consolas"/>
-                <w:sz w:val="17"/>
-              </w:rPr>
-              <w:t>├── requirements.txt                     &lt;- every package for the whole course</w:t>
-            </w:r>
-            <w:r>
-              <w:br/>
-            </w:r>
-            <w:r>
-              <w:rPr>
-                <w:rFonts w:ascii="Consolas" w:hAnsi="Consolas"/>
-                <w:sz w:val="17"/>
-              </w:rPr>
-              <w:t>├── .pip-constraints.txt                 &lt;- version pins, applied automatically</w:t>
-            </w:r>
-            <w:r>
-              <w:br/>
-            </w:r>
-            <w:r>
-              <w:rPr>
-                <w:rFonts w:ascii="Consolas" w:hAnsi="Consolas"/>
-                <w:sz w:val="17"/>
-              </w:rPr>
-              <w:t>├── 01_Introduction_to_AI/ ... 08_Cybersecurity_Orchestration/</w:t>
-            </w:r>
-            <w:r>
-              <w:br/>
-            </w:r>
-            <w:r>
-              <w:rPr>
-                <w:rFonts w:ascii="Consolas" w:hAnsi="Consolas"/>
-                <w:sz w:val="17"/>
-              </w:rPr>
-              <w:t>└── 04_RAG/</w:t>
-            </w:r>
-            <w:r>
-              <w:br/>
-            </w:r>
-            <w:r>
-              <w:rPr>
-                <w:rFonts w:ascii="Consolas" w:hAnsi="Consolas"/>
-                <w:sz w:val="17"/>
-              </w:rPr>
-              <w:t xml:space="preserve">    ├── requirements.txt                 &lt;- this module's packages</w:t>
-            </w:r>
-            <w:r>
-              <w:br/>
-            </w:r>
-            <w:r>
-              <w:rPr>
-                <w:rFonts w:ascii="Consolas" w:hAnsi="Consolas"/>
-                <w:sz w:val="17"/>
-              </w:rPr>
-              <w:t xml:space="preserve">    ├── code/</w:t>
-            </w:r>
-            <w:r>
-              <w:br/>
-            </w:r>
-            <w:r>
-              <w:rPr>
-                <w:rFonts w:ascii="Consolas" w:hAnsi="Consolas"/>
-                <w:sz w:val="17"/>
-              </w:rPr>
-              <w:t xml:space="preserve">    │   ├── ssrf.txt</w:t>
-            </w:r>
-            <w:r>
-              <w:br/>
-            </w:r>
-            <w:r>
-              <w:rPr>
-                <w:rFonts w:ascii="Consolas" w:hAnsi="Consolas"/>
-                <w:sz w:val="17"/>
-              </w:rPr>
-              <w:t xml:space="preserve">    │   └── cybersecurity_kb.md</w:t>
-            </w:r>
-            <w:r>
-              <w:br/>
-            </w:r>
-            <w:r>
-              <w:rPr>
-                <w:rFonts w:ascii="Consolas" w:hAnsi="Consolas"/>
-                <w:sz w:val="17"/>
-              </w:rPr>
-              <w:t xml:space="preserve">    └── assignments/project/</w:t>
-            </w:r>
-            <w:r>
-              <w:br/>
-            </w:r>
-            <w:r>
-              <w:rPr>
-                <w:rFonts w:ascii="Consolas" w:hAnsi="Consolas"/>
-                <w:sz w:val="17"/>
-              </w:rPr>
-              <w:t xml:space="preserve">        ├── MiniProject_RAG_Starter.ipynb     &lt;- run it from this folder</w:t>
-            </w:r>
-            <w:r>
-              <w:br/>
-            </w:r>
-            <w:r>
-              <w:rPr>
-                <w:rFonts w:ascii="Consolas" w:hAnsi="Consolas"/>
-                <w:sz w:val="17"/>
-              </w:rPr>
-              <w:t xml:space="preserve">        └── baseline_goldset.json</w:t>
-            </w:r>
-          </w:p>
-        </w:tc>
-      </w:tr>
-    </w:tbl>
-    <w:p>
-      <w:pPr>
-        <w:spacing w:before="0" w:after="40"/>
-      </w:pPr>
-    </w:p>
-    <w:p>
-      <w:r>
-        <w:rPr>
-          <w:b w:val="0"/>
-        </w:rPr>
-        <w:t xml:space="preserve">The notebook finds its files by </w:t>
-      </w:r>
-      <w:r>
-        <w:rPr>
-          <w:b/>
-        </w:rPr>
-        <w:t>relative paths</w:t>
-      </w:r>
-      <w:r>
-        <w:rPr>
-          <w:b w:val="0"/>
-        </w:rPr>
-        <w:t xml:space="preserve">, starting from the notebook's own folder. For example, </w:t>
-      </w:r>
-      <w:r>
-        <w:rPr>
-          <w:rFonts w:ascii="Consolas" w:hAnsi="Consolas"/>
-          <w:b w:val="0"/>
-          <w:sz w:val="19"/>
-          <w:shd w:val="clear" w:color="auto" w:fill="E8ECF0"/>
-        </w:rPr>
-        <w:t>../../code/ssrf.txt</w:t>
-      </w:r>
-      <w:r>
-        <w:rPr>
-          <w:b w:val="0"/>
-        </w:rPr>
-        <w:t xml:space="preserve"> means "go up two folders to </w:t>
-      </w:r>
-      <w:r>
-        <w:rPr>
-          <w:rFonts w:ascii="Consolas" w:hAnsi="Consolas"/>
-          <w:b w:val="0"/>
-          <w:sz w:val="19"/>
-          <w:shd w:val="clear" w:color="auto" w:fill="E8ECF0"/>
-        </w:rPr>
-        <w:t>04_RAG</w:t>
-      </w:r>
-      <w:r>
-        <w:rPr>
-          <w:b w:val="0"/>
-        </w:rPr>
-        <w:t xml:space="preserve">, then into </w:t>
-      </w:r>
-      <w:r>
-        <w:rPr>
-          <w:rFonts w:ascii="Consolas" w:hAnsi="Consolas"/>
-          <w:b w:val="0"/>
-          <w:sz w:val="19"/>
-          <w:shd w:val="clear" w:color="auto" w:fill="E8ECF0"/>
-        </w:rPr>
-        <w:t>code</w:t>
-      </w:r>
-      <w:r>
-        <w:rPr>
-          <w:b w:val="0"/>
-        </w:rPr>
-        <w:t>". Keep this layout and run the notebook from its own folder, and every path works, whatever you call the top folder and wherever you put it.</w:t>
-      </w:r>
-    </w:p>
-    <w:tbl>
-      <w:tblPr>
-        <w:tblW w:type="auto" w:w="0"/>
-        <w:jc w:val="center"/>
-        <w:tblLook w:firstColumn="1" w:firstRow="1" w:lastColumn="0" w:lastRow="0" w:noHBand="0" w:noVBand="1" w:val="04A0"/>
-      </w:tblPr>
-      <w:tblGrid>
-        <w:gridCol w:w="9792"/>
-      </w:tblGrid>
-      <w:tr>
-        <w:tc>
-          <w:tcPr>
-            <w:tcW w:type="dxa" w:w="9792"/>
-            <w:shd w:val="clear" w:color="auto" w:fill="F3F5F7"/>
-            <w:tcBorders>
-              <w:top w:val="nil"/>
-              <w:left w:val="single" w:sz="36" w:color="A3122A"/>
-              <w:bottom w:val="nil"/>
-              <w:right w:val="nil"/>
-            </w:tcBorders>
-            <w:tcMar>
-              <w:top w:w="120" w:type="dxa"/>
-              <w:bottom w:w="120" w:type="dxa"/>
-              <w:left w:w="200" w:type="dxa"/>
-              <w:right w:w="200" w:type="dxa"/>
-            </w:tcMar>
-          </w:tcPr>
-          <w:p>
-            <w:pPr>
-              <w:spacing w:before="0" w:after="60"/>
-            </w:pPr>
-            <w:r>
-              <w:rPr>
-                <w:b/>
-              </w:rPr>
-              <w:t>Keep the folders as they are</w:t>
-            </w:r>
-          </w:p>
-          <w:p>
-            <w:pPr>
-              <w:spacing w:before="0" w:after="0"/>
-            </w:pPr>
-            <w:r>
-              <w:rPr>
-                <w:b w:val="0"/>
-              </w:rPr>
-              <w:t>Paths break when you move the notebook, rename a folder, or open the notebook on its own without the rest of the repository. Steps 3 and 5 make sure none of these happen.</w:t>
-            </w:r>
-          </w:p>
-        </w:tc>
-      </w:tr>
-    </w:tbl>
-    <w:p>
-      <w:pPr>
-        <w:spacing w:before="0" w:after="40"/>
-      </w:pPr>
-    </w:p>
-    <w:p>
-      <w:pPr>
-        <w:pStyle w:val="Heading2"/>
-        <w:keepNext/>
-        <w:pBdr>
-          <w:bottom w:val="single" w:sz="18" w:space="3" w:color="A3122A"/>
-        </w:pBdr>
-        <w:spacing w:before="280" w:after="120"/>
-      </w:pPr>
-      <w:r>
-        <w:rPr>
-          <w:b w:val="0"/>
-        </w:rPr>
-        <w:t>3. Get the code and open the notebook</w:t>
+        <w:t>Pick where you will work. You can switch later: the notebook is the same everywhere.</w:t>
       </w:r>
     </w:p>
     <w:p>
@@ -1171,7 +93,7 @@
         <w:rPr>
           <w:b w:val="0"/>
         </w:rPr>
-        <w:t>A. Google Colab</w:t>
+        <w:t>Google Colab</w:t>
       </w:r>
     </w:p>
     <w:p>
@@ -1192,7 +114,7 @@
         </w:rPr>
         <w:t xml:space="preserve">Go to </w:t>
       </w:r>
-      <w:hyperlink r:id="rId10">
+      <w:hyperlink r:id="rId9">
         <w:r>
           <w:rPr>
             <w:color w:val="0B4F8A"/>
@@ -1205,7 +127,7 @@
         <w:rPr>
           <w:b w:val="0"/>
         </w:rPr>
-        <w:t xml:space="preserve"> and choose </w:t>
+        <w:t xml:space="preserve">, choose </w:t>
       </w:r>
       <w:r>
         <w:rPr>
@@ -1217,26 +139,7 @@
         <w:rPr>
           <w:b w:val="0"/>
         </w:rPr>
-        <w:t>. This blank notebook is only for the next command.</w:t>
-      </w:r>
-    </w:p>
-    <w:p>
-      <w:pPr>
-        <w:tabs>
-          <w:tab w:pos="504" w:val="left"/>
-        </w:tabs>
-        <w:spacing w:before="0" w:after="80"/>
-        <w:ind w:left="504" w:hanging="360"/>
-      </w:pPr>
-      <w:r>
-        <w:t>2.</w:t>
-        <w:tab/>
-      </w:r>
-      <w:r>
-        <w:rPr>
-          <w:b w:val="0"/>
-        </w:rPr>
-        <w:t>Paste this into a cell and run it once. It saves a copy of the repository in your Google Drive, so your work is still there when Colab shuts down. Allow access to Drive when Colab asks.</w:t>
+        <w:t>, and run this once. It copies the course repository into your Google Drive.</w:t>
       </w:r>
     </w:p>
     <w:tbl>
@@ -1315,7 +218,7 @@
         <w:ind w:left="504" w:hanging="360"/>
       </w:pPr>
       <w:r>
-        <w:t>3.</w:t>
+        <w:t>2.</w:t>
         <w:tab/>
       </w:r>
       <w:r>
@@ -1373,119 +276,14 @@
         <w:ind w:left="504" w:hanging="360"/>
       </w:pPr>
       <w:r>
-        <w:t>4.</w:t>
+        <w:t>3.</w:t>
         <w:tab/>
       </w:r>
       <w:r>
         <w:rPr>
           <w:b w:val="0"/>
         </w:rPr>
-        <w:t>Add the setup cell from step 5 as the first cell, and run it.</w:t>
-      </w:r>
-    </w:p>
-    <w:tbl>
-      <w:tblPr>
-        <w:tblW w:type="auto" w:w="0"/>
-        <w:jc w:val="center"/>
-        <w:tblLook w:firstColumn="1" w:firstRow="1" w:lastColumn="0" w:lastRow="0" w:noHBand="0" w:noVBand="1" w:val="04A0"/>
-      </w:tblPr>
-      <w:tblGrid>
-        <w:gridCol w:w="9792"/>
-      </w:tblGrid>
-      <w:tr>
-        <w:tc>
-          <w:tcPr>
-            <w:tcW w:type="dxa" w:w="9792"/>
-            <w:shd w:val="clear" w:color="auto" w:fill="F3F5F7"/>
-            <w:tcBorders>
-              <w:top w:val="nil"/>
-              <w:left w:val="single" w:sz="36" w:color="A3122A"/>
-              <w:bottom w:val="nil"/>
-              <w:right w:val="nil"/>
-            </w:tcBorders>
-            <w:tcMar>
-              <w:top w:w="120" w:type="dxa"/>
-              <w:bottom w:w="120" w:type="dxa"/>
-              <w:left w:w="200" w:type="dxa"/>
-              <w:right w:w="200" w:type="dxa"/>
-            </w:tcMar>
-          </w:tcPr>
-          <w:p>
-            <w:pPr>
-              <w:spacing w:before="0" w:after="60"/>
-            </w:pPr>
-            <w:r>
-              <w:rPr>
-                <w:b/>
-              </w:rPr>
-              <w:t>Why not open the notebook straight from GitHub?</w:t>
-            </w:r>
-          </w:p>
-          <w:p>
-            <w:pPr>
-              <w:spacing w:before="0" w:after="0"/>
-            </w:pPr>
-            <w:r>
-              <w:rPr>
-                <w:b w:val="0"/>
-              </w:rPr>
-              <w:t xml:space="preserve">Colab's </w:t>
-            </w:r>
-            <w:r>
-              <w:rPr>
-                <w:b/>
-              </w:rPr>
-              <w:t>Open notebook → GitHub</w:t>
-            </w:r>
-            <w:r>
-              <w:rPr>
-                <w:b w:val="0"/>
-              </w:rPr>
-              <w:t xml:space="preserve"> loads the notebook but none of the files next to it, and starts in </w:t>
-            </w:r>
-            <w:r>
-              <w:rPr>
-                <w:rFonts w:ascii="Consolas" w:hAnsi="Consolas"/>
-                <w:b w:val="0"/>
-                <w:sz w:val="19"/>
-                <w:shd w:val="clear" w:color="auto" w:fill="E8ECF0"/>
-              </w:rPr>
-              <w:t>/content</w:t>
-            </w:r>
-            <w:r>
-              <w:rPr>
-                <w:b w:val="0"/>
-              </w:rPr>
-              <w:t xml:space="preserve"> instead of the notebook's folder. That combination is what causes the path errors. Colab also forgets installed packages whenever the session ends, so the setup cell reinstalls them and moves into the right folder every time you run it.</w:t>
-            </w:r>
-          </w:p>
-        </w:tc>
-      </w:tr>
-    </w:tbl>
-    <w:p>
-      <w:pPr>
-        <w:spacing w:before="0" w:after="40"/>
-      </w:pPr>
-    </w:p>
-    <w:p>
-      <w:pPr>
-        <w:pStyle w:val="Heading3"/>
-        <w:keepNext/>
-        <w:spacing w:before="200" w:after="60"/>
-      </w:pPr>
-      <w:r>
-        <w:rPr>
-          <w:b w:val="0"/>
-        </w:rPr>
-        <w:t>B. Jetstream2 VM</w:t>
-      </w:r>
-    </w:p>
-    <w:p>
-      <w:r>
-        <w:rPr>
-          <w:b w:val="0"/>
-        </w:rPr>
-        <w:t xml:space="preserve">Open a terminal on your VM, either on the desktop (see the VM Access Guide) or with </w:t>
+        <w:t xml:space="preserve">Add a code cell at the very top of the notebook, paste this in, and run it. Do this every time you open the notebook: Colab starts in </w:t>
       </w:r>
       <w:r>
         <w:rPr>
@@ -1494,13 +292,13 @@
           <w:sz w:val="19"/>
           <w:shd w:val="clear" w:color="auto" w:fill="E8ECF0"/>
         </w:rPr>
-        <w:t>ssh exouser@&lt;your-VM-IP&gt;</w:t>
+        <w:t>/content</w:t>
       </w:r>
       <w:r>
         <w:rPr>
           <w:b w:val="0"/>
         </w:rPr>
-        <w:t>. Then run:</w:t>
+        <w:t>, not in the notebook's folder, and without this cell the notebook cannot find its files.</w:t>
       </w:r>
     </w:p>
     <w:tbl>
@@ -1539,7 +337,7 @@
                 <w:rFonts w:ascii="Consolas" w:hAnsi="Consolas"/>
                 <w:sz w:val="17"/>
               </w:rPr>
-              <w:t>cd ~</w:t>
+              <w:t>from google.colab import drive</w:t>
             </w:r>
             <w:r>
               <w:br/>
@@ -1549,7 +347,7 @@
                 <w:rFonts w:ascii="Consolas" w:hAnsi="Consolas"/>
                 <w:sz w:val="17"/>
               </w:rPr>
-              <w:t>git clone https://github.com/li2cc/IT7075-Applied-AI-for-Cybersecurity.git IT7075</w:t>
+              <w:t>drive.mount("/content/drive")</w:t>
             </w:r>
             <w:r>
               <w:br/>
@@ -1559,27 +357,7 @@
                 <w:rFonts w:ascii="Consolas" w:hAnsi="Consolas"/>
                 <w:sz w:val="17"/>
               </w:rPr>
-              <w:t>cd IT7075</w:t>
-            </w:r>
-            <w:r>
-              <w:br/>
-            </w:r>
-            <w:r>
-              <w:rPr>
-                <w:rFonts w:ascii="Consolas" w:hAnsi="Consolas"/>
-                <w:sz w:val="17"/>
-              </w:rPr>
-              <w:t>python3 -m venv .venv</w:t>
-            </w:r>
-            <w:r>
-              <w:br/>
-            </w:r>
-            <w:r>
-              <w:rPr>
-                <w:rFonts w:ascii="Consolas" w:hAnsi="Consolas"/>
-                <w:sz w:val="17"/>
-              </w:rPr>
-              <w:t>source .venv/bin/activate</w:t>
+              <w:t>%cd /content/drive/MyDrive/IT7075/04_RAG/assignments/project</w:t>
             </w:r>
           </w:p>
         </w:tc>
@@ -1591,203 +369,6 @@
       </w:pPr>
     </w:p>
     <w:p>
-      <w:r>
-        <w:rPr>
-          <w:b w:val="0"/>
-        </w:rPr>
-        <w:t>Install the packages (step 4), then open the notebook in one of these three ways:</w:t>
-      </w:r>
-    </w:p>
-    <w:p>
-      <w:pPr>
-        <w:tabs>
-          <w:tab w:pos="504" w:val="left"/>
-        </w:tabs>
-        <w:spacing w:before="0" w:after="80"/>
-        <w:ind w:left="504" w:hanging="360"/>
-      </w:pPr>
-      <w:r>
-        <w:t>•</w:t>
-        <w:tab/>
-      </w:r>
-      <w:r>
-        <w:rPr>
-          <w:b/>
-        </w:rPr>
-        <w:t>VS Code with Remote-SSH</w:t>
-      </w:r>
-      <w:r>
-        <w:rPr>
-          <w:b w:val="0"/>
-        </w:rPr>
-        <w:t xml:space="preserve"> (set up in Module 02): connect to the VM, choose </w:t>
-      </w:r>
-      <w:r>
-        <w:rPr>
-          <w:b/>
-        </w:rPr>
-        <w:t>File → Open Folder → ~/IT7075</w:t>
-      </w:r>
-      <w:r>
-        <w:rPr>
-          <w:b w:val="0"/>
-        </w:rPr>
-        <w:t xml:space="preserve">, open </w:t>
-      </w:r>
-      <w:r>
-        <w:rPr>
-          <w:rFonts w:ascii="Consolas" w:hAnsi="Consolas"/>
-          <w:b w:val="0"/>
-          <w:sz w:val="19"/>
-          <w:shd w:val="clear" w:color="auto" w:fill="E8ECF0"/>
-        </w:rPr>
-        <w:t>04_RAG/assignments/project/MiniProject_RAG_Starter.ipynb</w:t>
-      </w:r>
-      <w:r>
-        <w:rPr>
-          <w:b w:val="0"/>
-        </w:rPr>
-        <w:t xml:space="preserve">, and pick the </w:t>
-      </w:r>
-      <w:r>
-        <w:rPr>
-          <w:rFonts w:ascii="Consolas" w:hAnsi="Consolas"/>
-          <w:b w:val="0"/>
-          <w:sz w:val="19"/>
-          <w:shd w:val="clear" w:color="auto" w:fill="E8ECF0"/>
-        </w:rPr>
-        <w:t>.venv</w:t>
-      </w:r>
-      <w:r>
-        <w:rPr>
-          <w:b w:val="0"/>
-        </w:rPr>
-        <w:t xml:space="preserve"> interpreter under </w:t>
-      </w:r>
-      <w:r>
-        <w:rPr>
-          <w:b/>
-        </w:rPr>
-        <w:t>Select Kernel</w:t>
-      </w:r>
-      <w:r>
-        <w:rPr>
-          <w:b w:val="0"/>
-        </w:rPr>
-        <w:t>.</w:t>
-      </w:r>
-    </w:p>
-    <w:p>
-      <w:pPr>
-        <w:tabs>
-          <w:tab w:pos="504" w:val="left"/>
-        </w:tabs>
-        <w:spacing w:before="0" w:after="80"/>
-        <w:ind w:left="504" w:hanging="360"/>
-      </w:pPr>
-      <w:r>
-        <w:t>•</w:t>
-        <w:tab/>
-      </w:r>
-      <w:r>
-        <w:rPr>
-          <w:b/>
-        </w:rPr>
-        <w:t>JupyterLab on the VM desktop</w:t>
-      </w:r>
-      <w:r>
-        <w:rPr>
-          <w:b w:val="0"/>
-        </w:rPr>
-        <w:t xml:space="preserve">: in a desktop terminal, run </w:t>
-      </w:r>
-      <w:r>
-        <w:rPr>
-          <w:rFonts w:ascii="Consolas" w:hAnsi="Consolas"/>
-          <w:b w:val="0"/>
-          <w:sz w:val="19"/>
-          <w:shd w:val="clear" w:color="auto" w:fill="E8ECF0"/>
-        </w:rPr>
-        <w:t>source ~/IT7075/.venv/bin/activate &amp;&amp; jupyter lab ~/IT7075</w:t>
-      </w:r>
-      <w:r>
-        <w:rPr>
-          <w:b w:val="0"/>
-        </w:rPr>
-        <w:t>. A browser opens on the VM.</w:t>
-      </w:r>
-    </w:p>
-    <w:p>
-      <w:pPr>
-        <w:tabs>
-          <w:tab w:pos="504" w:val="left"/>
-        </w:tabs>
-        <w:spacing w:before="0" w:after="80"/>
-        <w:ind w:left="504" w:hanging="360"/>
-      </w:pPr>
-      <w:r>
-        <w:t>•</w:t>
-        <w:tab/>
-      </w:r>
-      <w:r>
-        <w:rPr>
-          <w:b/>
-        </w:rPr>
-        <w:t>JupyterLab through an SSH tunnel</w:t>
-      </w:r>
-      <w:r>
-        <w:rPr>
-          <w:b w:val="0"/>
-        </w:rPr>
-        <w:t xml:space="preserve">: on the VM, run </w:t>
-      </w:r>
-      <w:r>
-        <w:rPr>
-          <w:rFonts w:ascii="Consolas" w:hAnsi="Consolas"/>
-          <w:b w:val="0"/>
-          <w:sz w:val="19"/>
-          <w:shd w:val="clear" w:color="auto" w:fill="E8ECF0"/>
-        </w:rPr>
-        <w:t>jupyter lab --no-browser --port 8888</w:t>
-      </w:r>
-      <w:r>
-        <w:rPr>
-          <w:b w:val="0"/>
-        </w:rPr>
-        <w:t xml:space="preserve">. On your computer, run </w:t>
-      </w:r>
-      <w:r>
-        <w:rPr>
-          <w:rFonts w:ascii="Consolas" w:hAnsi="Consolas"/>
-          <w:b w:val="0"/>
-          <w:sz w:val="19"/>
-          <w:shd w:val="clear" w:color="auto" w:fill="E8ECF0"/>
-        </w:rPr>
-        <w:t>ssh -N -L 8888:localhost:8888 exouser@&lt;your-VM-IP&gt;</w:t>
-      </w:r>
-      <w:r>
-        <w:rPr>
-          <w:b w:val="0"/>
-        </w:rPr>
-        <w:t xml:space="preserve">, then open the </w:t>
-      </w:r>
-      <w:r>
-        <w:rPr>
-          <w:rFonts w:ascii="Consolas" w:hAnsi="Consolas"/>
-          <w:b w:val="0"/>
-          <w:sz w:val="19"/>
-          <w:shd w:val="clear" w:color="auto" w:fill="E8ECF0"/>
-        </w:rPr>
-        <w:t>http://localhost:8888/lab?token=...</w:t>
-      </w:r>
-      <w:r>
-        <w:rPr>
-          <w:b w:val="0"/>
-        </w:rPr>
-        <w:t xml:space="preserve"> link the VM printed.</w:t>
-      </w:r>
-    </w:p>
-    <w:p>
       <w:pPr>
         <w:pStyle w:val="Heading3"/>
         <w:keepNext/>
@@ -1797,7 +378,7 @@
         <w:rPr>
           <w:b w:val="0"/>
         </w:rPr>
-        <w:t>C. Your own computer</w:t>
+        <w:t>Jetstream2 or your own computer</w:t>
       </w:r>
     </w:p>
     <w:p>
@@ -1805,49 +386,7 @@
         <w:rPr>
           <w:b w:val="0"/>
         </w:rPr>
-        <w:t xml:space="preserve">Install Python 3.10, 3.11 or 3.12 from </w:t>
-      </w:r>
-      <w:hyperlink r:id="rId11">
-        <w:r>
-          <w:rPr>
-            <w:color w:val="0B4F8A"/>
-            <w:u w:val="single"/>
-          </w:rPr>
-          <w:t xml:space="preserve">python.org</w:t>
-        </w:r>
-      </w:hyperlink>
-      <w:r>
-        <w:rPr>
-          <w:b w:val="0"/>
-        </w:rPr>
-        <w:t xml:space="preserve">, and Git from </w:t>
-      </w:r>
-      <w:hyperlink r:id="rId12">
-        <w:r>
-          <w:rPr>
-            <w:color w:val="0B4F8A"/>
-            <w:u w:val="single"/>
-          </w:rPr>
-          <w:t xml:space="preserve">git-scm.com</w:t>
-        </w:r>
-      </w:hyperlink>
-      <w:r>
-        <w:rPr>
-          <w:b w:val="0"/>
-        </w:rPr>
-        <w:t>. Then, in a terminal:</w:t>
-      </w:r>
-    </w:p>
-    <w:p>
-      <w:pPr>
-        <w:keepNext/>
-        <w:spacing w:before="120" w:after="40"/>
-      </w:pPr>
-      <w:r>
-        <w:rPr>
-          <w:b/>
-        </w:rPr>
-        <w:t>macOS or Linux</w:t>
+        <w:t>In a terminal (on Jetstream2, a terminal on the VM desktop; see the VM Access Guide), run:</w:t>
       </w:r>
     </w:p>
     <w:tbl>
@@ -1916,7 +455,27 @@
                 <w:rFonts w:ascii="Consolas" w:hAnsi="Consolas"/>
                 <w:sz w:val="17"/>
               </w:rPr>
-              <w:t>source .venv/bin/activate</w:t>
+              <w:t>source .venv/bin/activate        # Windows: .venv\Scripts\activate</w:t>
+            </w:r>
+            <w:r>
+              <w:br/>
+            </w:r>
+            <w:r>
+              <w:rPr>
+                <w:rFonts w:ascii="Consolas" w:hAnsi="Consolas"/>
+                <w:sz w:val="17"/>
+              </w:rPr>
+              <w:t>pip install jupyterlab</w:t>
+            </w:r>
+            <w:r>
+              <w:br/>
+            </w:r>
+            <w:r>
+              <w:rPr>
+                <w:rFonts w:ascii="Consolas" w:hAnsi="Consolas"/>
+                <w:sz w:val="17"/>
+              </w:rPr>
+              <w:t>jupyter lab</w:t>
             </w:r>
           </w:p>
         </w:tc>
@@ -1928,15 +487,155 @@
       </w:pPr>
     </w:p>
     <w:p>
+      <w:r>
+        <w:rPr>
+          <w:b w:val="0"/>
+        </w:rPr>
+        <w:t xml:space="preserve">In JupyterLab, open </w:t>
+      </w:r>
+      <w:r>
+        <w:rPr>
+          <w:rFonts w:ascii="Consolas" w:hAnsi="Consolas"/>
+          <w:b w:val="0"/>
+          <w:sz w:val="19"/>
+          <w:shd w:val="clear" w:color="auto" w:fill="E8ECF0"/>
+        </w:rPr>
+        <w:t>04_RAG/assignments/project/MiniProject_RAG_Starter.ipynb</w:t>
+      </w:r>
+      <w:r>
+        <w:rPr>
+          <w:b w:val="0"/>
+        </w:rPr>
+        <w:t xml:space="preserve">. Next time, just </w:t>
+      </w:r>
+      <w:r>
+        <w:rPr>
+          <w:rFonts w:ascii="Consolas" w:hAnsi="Consolas"/>
+          <w:b w:val="0"/>
+          <w:sz w:val="19"/>
+          <w:shd w:val="clear" w:color="auto" w:fill="E8ECF0"/>
+        </w:rPr>
+        <w:t>cd IT7075</w:t>
+      </w:r>
+      <w:r>
+        <w:rPr>
+          <w:b w:val="0"/>
+        </w:rPr>
+        <w:t xml:space="preserve">, activate </w:t>
+      </w:r>
+      <w:r>
+        <w:rPr>
+          <w:rFonts w:ascii="Consolas" w:hAnsi="Consolas"/>
+          <w:b w:val="0"/>
+          <w:sz w:val="19"/>
+          <w:shd w:val="clear" w:color="auto" w:fill="E8ECF0"/>
+        </w:rPr>
+        <w:t>.venv</w:t>
+      </w:r>
+      <w:r>
+        <w:rPr>
+          <w:b w:val="0"/>
+        </w:rPr>
+        <w:t xml:space="preserve">, and run </w:t>
+      </w:r>
+      <w:r>
+        <w:rPr>
+          <w:rFonts w:ascii="Consolas" w:hAnsi="Consolas"/>
+          <w:b w:val="0"/>
+          <w:sz w:val="19"/>
+          <w:shd w:val="clear" w:color="auto" w:fill="E8ECF0"/>
+        </w:rPr>
+        <w:t>jupyter lab</w:t>
+      </w:r>
+      <w:r>
+        <w:rPr>
+          <w:b w:val="0"/>
+        </w:rPr>
+        <w:t xml:space="preserve">. On your own computer you need </w:t>
+      </w:r>
+      <w:hyperlink r:id="rId10">
+        <w:r>
+          <w:rPr>
+            <w:color w:val="0B4F8A"/>
+            <w:u w:val="single"/>
+          </w:rPr>
+          <w:t xml:space="preserve">Python 3.10–3.12</w:t>
+        </w:r>
+      </w:hyperlink>
+      <w:r>
+        <w:rPr>
+          <w:b w:val="0"/>
+        </w:rPr>
+        <w:t xml:space="preserve"> and </w:t>
+      </w:r>
+      <w:hyperlink r:id="rId11">
+        <w:r>
+          <w:rPr>
+            <w:color w:val="0B4F8A"/>
+            <w:u w:val="single"/>
+          </w:rPr>
+          <w:t xml:space="preserve">Git</w:t>
+        </w:r>
+      </w:hyperlink>
+      <w:r>
+        <w:rPr>
+          <w:b w:val="0"/>
+        </w:rPr>
+        <w:t xml:space="preserve">. On Windows, type </w:t>
+      </w:r>
+      <w:r>
+        <w:rPr>
+          <w:rFonts w:ascii="Consolas" w:hAnsi="Consolas"/>
+          <w:b w:val="0"/>
+          <w:sz w:val="19"/>
+          <w:shd w:val="clear" w:color="auto" w:fill="E8ECF0"/>
+        </w:rPr>
+        <w:t>python</w:t>
+      </w:r>
+      <w:r>
+        <w:rPr>
+          <w:b w:val="0"/>
+        </w:rPr>
+        <w:t xml:space="preserve"> instead of </w:t>
+      </w:r>
+      <w:r>
+        <w:rPr>
+          <w:rFonts w:ascii="Consolas" w:hAnsi="Consolas"/>
+          <w:b w:val="0"/>
+          <w:sz w:val="19"/>
+          <w:shd w:val="clear" w:color="auto" w:fill="E8ECF0"/>
+        </w:rPr>
+        <w:t>python3</w:t>
+      </w:r>
+      <w:r>
+        <w:rPr>
+          <w:b w:val="0"/>
+        </w:rPr>
+        <w:t>.</w:t>
+      </w:r>
+    </w:p>
+    <w:p>
       <w:pPr>
+        <w:pStyle w:val="Heading2"/>
         <w:keepNext/>
-        <w:spacing w:before="120" w:after="40"/>
+        <w:pBdr>
+          <w:bottom w:val="single" w:sz="18" w:space="3" w:color="A3122A"/>
+        </w:pBdr>
+        <w:spacing w:before="280" w:after="120"/>
       </w:pPr>
       <w:r>
         <w:rPr>
-          <w:b/>
+          <w:b w:val="0"/>
         </w:rPr>
-        <w:t>Windows (PowerShell)</w:t>
+        <w:t>2. Install the packages</w:t>
+      </w:r>
+    </w:p>
+    <w:p>
+      <w:r>
+        <w:rPr>
+          <w:b w:val="0"/>
+        </w:rPr>
+        <w:t>Find this line at the top of the notebook's first code cell:</w:t>
       </w:r>
     </w:p>
     <w:tbl>
@@ -1975,37 +674,7 @@
                 <w:rFonts w:ascii="Consolas" w:hAnsi="Consolas"/>
                 <w:sz w:val="17"/>
               </w:rPr>
-              <w:t>git clone https://github.com/li2cc/IT7075-Applied-AI-for-Cybersecurity.git IT7075</w:t>
-            </w:r>
-            <w:r>
-              <w:br/>
-            </w:r>
-            <w:r>
-              <w:rPr>
-                <w:rFonts w:ascii="Consolas" w:hAnsi="Consolas"/>
-                <w:sz w:val="17"/>
-              </w:rPr>
-              <w:t>cd IT7075</w:t>
-            </w:r>
-            <w:r>
-              <w:br/>
-            </w:r>
-            <w:r>
-              <w:rPr>
-                <w:rFonts w:ascii="Consolas" w:hAnsi="Consolas"/>
-                <w:sz w:val="17"/>
-              </w:rPr>
-              <w:t>py -3.12 -m venv .venv</w:t>
-            </w:r>
-            <w:r>
-              <w:br/>
-            </w:r>
-            <w:r>
-              <w:rPr>
-                <w:rFonts w:ascii="Consolas" w:hAnsi="Consolas"/>
-                <w:sz w:val="17"/>
-              </w:rPr>
-              <w:t>.venv\Scripts\Activate.ps1</w:t>
+              <w:t># If needed:  !pip install -q sentence-transformers chromadb pandas matplotlib openai</w:t>
             </w:r>
           </w:p>
         </w:tc>
@@ -2021,19 +690,7 @@
         <w:rPr>
           <w:b w:val="0"/>
         </w:rPr>
-        <w:t>Install the packages (step 4), then open the notebook in VS Code (</w:t>
-      </w:r>
-      <w:r>
-        <w:rPr>
-          <w:b/>
-        </w:rPr>
-        <w:t>Select Kernel → .venv</w:t>
-      </w:r>
-      <w:r>
-        <w:rPr>
-          <w:b w:val="0"/>
-        </w:rPr>
-        <w:t xml:space="preserve">) or run </w:t>
+        <w:t xml:space="preserve">Delete </w:t>
       </w:r>
       <w:r>
         <w:rPr>
@@ -2042,13 +699,13 @@
           <w:sz w:val="19"/>
           <w:shd w:val="clear" w:color="auto" w:fill="E8ECF0"/>
         </w:rPr>
-        <w:t>jupyter lab</w:t>
+        <w:t># If needed:</w:t>
       </w:r>
       <w:r>
         <w:rPr>
           <w:b w:val="0"/>
         </w:rPr>
-        <w:t xml:space="preserve"> from the </w:t>
+        <w:t xml:space="preserve"> so the line starts with </w:t>
       </w:r>
       <w:r>
         <w:rPr>
@@ -2057,13 +714,93 @@
           <w:sz w:val="19"/>
           <w:shd w:val="clear" w:color="auto" w:fill="E8ECF0"/>
         </w:rPr>
-        <w:t>IT7075</w:t>
+        <w:t>!pip</w:t>
       </w:r>
       <w:r>
         <w:rPr>
           <w:b w:val="0"/>
         </w:rPr>
-        <w:t xml:space="preserve"> folder.</w:t>
+        <w:t>, then run the cell. This installs every package the notebook needs.</w:t>
+      </w:r>
+    </w:p>
+    <w:p>
+      <w:pPr>
+        <w:tabs>
+          <w:tab w:pos="504" w:val="left"/>
+        </w:tabs>
+        <w:spacing w:before="0" w:after="80"/>
+        <w:ind w:left="504" w:hanging="360"/>
+      </w:pPr>
+      <w:r>
+        <w:t>•</w:t>
+        <w:tab/>
+      </w:r>
+      <w:r>
+        <w:rPr>
+          <w:b/>
+        </w:rPr>
+        <w:t>Colab:</w:t>
+      </w:r>
+      <w:r>
+        <w:rPr>
+          <w:b w:val="0"/>
+        </w:rPr>
+        <w:t xml:space="preserve"> run it again in every new session. Colab forgets installed packages when it shuts down.</w:t>
+      </w:r>
+    </w:p>
+    <w:p>
+      <w:pPr>
+        <w:tabs>
+          <w:tab w:pos="504" w:val="left"/>
+        </w:tabs>
+        <w:spacing w:before="0" w:after="80"/>
+        <w:ind w:left="504" w:hanging="360"/>
+      </w:pPr>
+      <w:r>
+        <w:t>•</w:t>
+        <w:tab/>
+      </w:r>
+      <w:r>
+        <w:rPr>
+          <w:b/>
+        </w:rPr>
+        <w:t>JupyterLab or VS Code:</w:t>
+      </w:r>
+      <w:r>
+        <w:rPr>
+          <w:b w:val="0"/>
+        </w:rPr>
+        <w:t xml:space="preserve"> change </w:t>
+      </w:r>
+      <w:r>
+        <w:rPr>
+          <w:rFonts w:ascii="Consolas" w:hAnsi="Consolas"/>
+          <w:b w:val="0"/>
+          <w:sz w:val="19"/>
+          <w:shd w:val="clear" w:color="auto" w:fill="E8ECF0"/>
+        </w:rPr>
+        <w:t>!pip</w:t>
+      </w:r>
+      <w:r>
+        <w:rPr>
+          <w:b w:val="0"/>
+        </w:rPr>
+        <w:t xml:space="preserve"> to </w:t>
+      </w:r>
+      <w:r>
+        <w:rPr>
+          <w:rFonts w:ascii="Consolas" w:hAnsi="Consolas"/>
+          <w:b w:val="0"/>
+          <w:sz w:val="19"/>
+          <w:shd w:val="clear" w:color="auto" w:fill="E8ECF0"/>
+        </w:rPr>
+        <w:t>%pip</w:t>
+      </w:r>
+      <w:r>
+        <w:rPr>
+          <w:b w:val="0"/>
+        </w:rPr>
+        <w:t>, so the packages go into the notebook's own Python. You only need to run it once.</w:t>
       </w:r>
     </w:p>
     <w:p>
@@ -2079,7 +816,7 @@
         <w:rPr>
           <w:b w:val="0"/>
         </w:rPr>
-        <w:t>4. Install all the packages at once</w:t>
+        <w:t>3. Run the notebook</w:t>
       </w:r>
     </w:p>
     <w:p>
@@ -2087,7 +824,7 @@
         <w:rPr>
           <w:b w:val="0"/>
         </w:rPr>
-        <w:t xml:space="preserve">Each module has a </w:t>
+        <w:t xml:space="preserve">Run the cells from top to bottom. Part 1 should print </w:t>
       </w:r>
       <w:r>
         <w:rPr>
@@ -2096,13 +833,13 @@
           <w:sz w:val="19"/>
           <w:shd w:val="clear" w:color="auto" w:fill="E8ECF0"/>
         </w:rPr>
-        <w:t>requirements.txt</w:t>
+        <w:t>ssrf.txt -&gt; 11 chunks</w:t>
       </w:r>
       <w:r>
         <w:rPr>
           <w:b w:val="0"/>
         </w:rPr>
-        <w:t xml:space="preserve"> that lists its packages, and the one in the </w:t>
+        <w:t xml:space="preserve">, </w:t>
       </w:r>
       <w:r>
         <w:rPr>
@@ -2111,384 +848,25 @@
           <w:sz w:val="19"/>
           <w:shd w:val="clear" w:color="auto" w:fill="E8ECF0"/>
         </w:rPr>
-        <w:t>IT7075</w:t>
+        <w:t>cybersecurity_kb.md -&gt; 11 chunks</w:t>
       </w:r>
       <w:r>
         <w:rPr>
           <w:b w:val="0"/>
         </w:rPr>
-        <w:t xml:space="preserve"> folder includes them all. Install from these files, not package by package. They also hold the version limits the notebooks were tested with, so a new release that changes an API cannot break your notebook.</w:t>
-      </w:r>
-    </w:p>
-    <w:p>
-      <w:pPr>
-        <w:pStyle w:val="Heading3"/>
-        <w:keepNext/>
-        <w:spacing w:before="200" w:after="60"/>
-      </w:pPr>
-      <w:r>
-        <w:rPr>
-          <w:b w:val="0"/>
-        </w:rPr>
-        <w:t>Jetstream2 and your own computer: the whole course, once</w:t>
-      </w:r>
-    </w:p>
-    <w:p>
-      <w:r>
-        <w:rPr>
-          <w:b w:val="0"/>
-        </w:rPr>
-        <w:t xml:space="preserve">With your </w:t>
+        <w:t xml:space="preserve">, </w:t>
       </w:r>
       <w:r>
         <w:rPr>
-          <w:rFonts w:ascii="Consolas" w:hAnsi="Consolas"/>
-          <w:b w:val="0"/>
-          <w:sz w:val="19"/>
-          <w:shd w:val="clear" w:color="auto" w:fill="E8ECF0"/>
+          <w:b/>
         </w:rPr>
-        <w:t>.venv</w:t>
+        <w:t>22 total</w:t>
       </w:r>
       <w:r>
         <w:rPr>
           <w:b w:val="0"/>
         </w:rPr>
-        <w:t xml:space="preserve"> active, in the </w:t>
-      </w:r>
-      <w:r>
-        <w:rPr>
-          <w:rFonts w:ascii="Consolas" w:hAnsi="Consolas"/>
-          <w:b w:val="0"/>
-          <w:sz w:val="19"/>
-          <w:shd w:val="clear" w:color="auto" w:fill="E8ECF0"/>
-        </w:rPr>
-        <w:t>IT7075</w:t>
-      </w:r>
-      <w:r>
-        <w:rPr>
-          <w:b w:val="0"/>
-        </w:rPr>
-        <w:t xml:space="preserve"> folder, run:</w:t>
-      </w:r>
-    </w:p>
-    <w:tbl>
-      <w:tblPr>
-        <w:tblW w:type="auto" w:w="0"/>
-        <w:jc w:val="center"/>
-        <w:tblLook w:firstColumn="1" w:firstRow="1" w:lastColumn="0" w:lastRow="0" w:noHBand="0" w:noVBand="1" w:val="04A0"/>
-      </w:tblPr>
-      <w:tblGrid>
-        <w:gridCol w:w="9792"/>
-      </w:tblGrid>
-      <w:tr>
-        <w:tc>
-          <w:tcPr>
-            <w:tcW w:type="dxa" w:w="9792"/>
-            <w:shd w:val="clear" w:color="auto" w:fill="F3F5F7"/>
-            <w:tcBorders>
-              <w:top w:val="nil"/>
-              <w:left w:val="single" w:sz="36" w:color="0D1B2A"/>
-              <w:bottom w:val="nil"/>
-              <w:right w:val="nil"/>
-            </w:tcBorders>
-            <w:tcMar>
-              <w:top w:w="120" w:type="dxa"/>
-              <w:bottom w:w="120" w:type="dxa"/>
-              <w:left w:w="200" w:type="dxa"/>
-              <w:right w:w="200" w:type="dxa"/>
-            </w:tcMar>
-          </w:tcPr>
-          <w:p>
-            <w:pPr>
-              <w:spacing w:before="0" w:after="0" w:line="240" w:lineRule="auto"/>
-            </w:pPr>
-            <w:r>
-              <w:rPr>
-                <w:rFonts w:ascii="Consolas" w:hAnsi="Consolas"/>
-                <w:sz w:val="17"/>
-              </w:rPr>
-              <w:t>pip install --upgrade pip</w:t>
-            </w:r>
-            <w:r>
-              <w:br/>
-            </w:r>
-            <w:r>
-              <w:rPr>
-                <w:rFonts w:ascii="Consolas" w:hAnsi="Consolas"/>
-                <w:sz w:val="17"/>
-              </w:rPr>
-              <w:t># Jetstream2 only (see the box below):</w:t>
-            </w:r>
-            <w:r>
-              <w:br/>
-            </w:r>
-            <w:r>
-              <w:rPr>
-                <w:rFonts w:ascii="Consolas" w:hAnsi="Consolas"/>
-                <w:sz w:val="17"/>
-              </w:rPr>
-              <w:t>pip install torch --index-url https://download.pytorch.org/whl/cu121</w:t>
-            </w:r>
-            <w:r>
-              <w:br/>
-            </w:r>
-            <w:r>
-              <w:rPr>
-                <w:rFonts w:ascii="Consolas" w:hAnsi="Consolas"/>
-                <w:sz w:val="17"/>
-              </w:rPr>
-              <w:t>pip install -r requirements.txt</w:t>
-            </w:r>
-          </w:p>
-        </w:tc>
-      </w:tr>
-    </w:tbl>
-    <w:p>
-      <w:pPr>
-        <w:spacing w:before="0" w:after="40"/>
-      </w:pPr>
-    </w:p>
-    <w:p>
-      <w:r>
-        <w:rPr>
-          <w:b w:val="0"/>
-        </w:rPr>
-        <w:t xml:space="preserve">That installs everything for the whole semester, so later modules need no more setup. It takes 10 to 15 minutes and about 7 GB of disk. When you </w:t>
-      </w:r>
-      <w:r>
-        <w:rPr>
-          <w:rFonts w:ascii="Consolas" w:hAnsi="Consolas"/>
-          <w:b w:val="0"/>
-          <w:sz w:val="19"/>
-          <w:shd w:val="clear" w:color="auto" w:fill="E8ECF0"/>
-        </w:rPr>
-        <w:t>git pull</w:t>
-      </w:r>
-      <w:r>
-        <w:rPr>
-          <w:b w:val="0"/>
-        </w:rPr>
-        <w:t xml:space="preserve"> course updates, run </w:t>
-      </w:r>
-      <w:r>
-        <w:rPr>
-          <w:rFonts w:ascii="Consolas" w:hAnsi="Consolas"/>
-          <w:b w:val="0"/>
-          <w:sz w:val="19"/>
-          <w:shd w:val="clear" w:color="auto" w:fill="E8ECF0"/>
-        </w:rPr>
-        <w:t>pip install -r requirements.txt</w:t>
-      </w:r>
-      <w:r>
-        <w:rPr>
-          <w:b w:val="0"/>
-        </w:rPr>
-        <w:t xml:space="preserve"> again in case the list changed.</w:t>
-      </w:r>
-    </w:p>
-    <w:tbl>
-      <w:tblPr>
-        <w:tblW w:type="auto" w:w="0"/>
-        <w:jc w:val="center"/>
-        <w:tblLook w:firstColumn="1" w:firstRow="1" w:lastColumn="0" w:lastRow="0" w:noHBand="0" w:noVBand="1" w:val="04A0"/>
-      </w:tblPr>
-      <w:tblGrid>
-        <w:gridCol w:w="9792"/>
-      </w:tblGrid>
-      <w:tr>
-        <w:tc>
-          <w:tcPr>
-            <w:tcW w:type="dxa" w:w="9792"/>
-            <w:shd w:val="clear" w:color="auto" w:fill="F3F5F7"/>
-            <w:tcBorders>
-              <w:top w:val="nil"/>
-              <w:left w:val="single" w:sz="36" w:color="A3122A"/>
-              <w:bottom w:val="nil"/>
-              <w:right w:val="nil"/>
-            </w:tcBorders>
-            <w:tcMar>
-              <w:top w:w="120" w:type="dxa"/>
-              <w:bottom w:w="120" w:type="dxa"/>
-              <w:left w:w="200" w:type="dxa"/>
-              <w:right w:w="200" w:type="dxa"/>
-            </w:tcMar>
-          </w:tcPr>
-          <w:p>
-            <w:pPr>
-              <w:spacing w:before="0" w:after="60"/>
-            </w:pPr>
-            <w:r>
-              <w:rPr>
-                <w:b/>
-              </w:rPr>
-              <w:t>Jetstream2: do not skip the torch line</w:t>
-            </w:r>
-          </w:p>
-          <w:p>
-            <w:pPr>
-              <w:spacing w:before="0" w:after="0"/>
-            </w:pPr>
-            <w:r>
-              <w:rPr>
-                <w:b w:val="0"/>
-              </w:rPr>
-              <w:t xml:space="preserve">The default PyTorch build needs a newer NVIDIA driver than the class VMs have. Without the </w:t>
-            </w:r>
-            <w:r>
-              <w:rPr>
-                <w:rFonts w:ascii="Consolas" w:hAnsi="Consolas"/>
-                <w:b w:val="0"/>
-                <w:sz w:val="19"/>
-                <w:shd w:val="clear" w:color="auto" w:fill="E8ECF0"/>
-              </w:rPr>
-              <w:t>cu121</w:t>
-            </w:r>
-            <w:r>
-              <w:rPr>
-                <w:b w:val="0"/>
-              </w:rPr>
-              <w:t xml:space="preserve"> line, PyTorch installs but cannot see the GPU (</w:t>
-            </w:r>
-            <w:r>
-              <w:rPr>
-                <w:rFonts w:ascii="Consolas" w:hAnsi="Consolas"/>
-                <w:b w:val="0"/>
-                <w:sz w:val="19"/>
-                <w:shd w:val="clear" w:color="auto" w:fill="E8ECF0"/>
-              </w:rPr>
-              <w:t>torch.cuda.is_available()</w:t>
-            </w:r>
-            <w:r>
-              <w:rPr>
-                <w:b w:val="0"/>
-              </w:rPr>
-              <w:t xml:space="preserve"> returns </w:t>
-            </w:r>
-            <w:r>
-              <w:rPr>
-                <w:rFonts w:ascii="Consolas" w:hAnsi="Consolas"/>
-                <w:b w:val="0"/>
-                <w:sz w:val="19"/>
-                <w:shd w:val="clear" w:color="auto" w:fill="E8ECF0"/>
-              </w:rPr>
-              <w:t>False</w:t>
-            </w:r>
-            <w:r>
-              <w:rPr>
-                <w:b w:val="0"/>
-              </w:rPr>
-              <w:t xml:space="preserve">). On your own computer, </w:t>
-            </w:r>
-            <w:r>
-              <w:rPr>
-                <w:b/>
-              </w:rPr>
-              <w:t>leave that line out</w:t>
-            </w:r>
-            <w:r>
-              <w:rPr>
-                <w:b w:val="0"/>
-              </w:rPr>
-              <w:t xml:space="preserve">: the default build suits most computers. If yours has an NVIDIA GPU, </w:t>
-            </w:r>
-            <w:hyperlink r:id="rId13">
-              <w:r>
-                <w:rPr>
-                  <w:color w:val="0B4F8A"/>
-                  <w:u w:val="single"/>
-                </w:rPr>
-                <w:t xml:space="preserve">pytorch.org</w:t>
-              </w:r>
-            </w:hyperlink>
-            <w:r>
-              <w:rPr>
-                <w:b w:val="0"/>
-              </w:rPr>
-              <w:t xml:space="preserve"> gives the right command.</w:t>
-            </w:r>
-          </w:p>
-        </w:tc>
-      </w:tr>
-    </w:tbl>
-    <w:p>
-      <w:pPr>
-        <w:spacing w:before="0" w:after="40"/>
-      </w:pPr>
-    </w:p>
-    <w:p>
-      <w:pPr>
-        <w:pStyle w:val="Heading3"/>
-        <w:keepNext/>
-        <w:spacing w:before="200" w:after="60"/>
-      </w:pPr>
-      <w:r>
-        <w:rPr>
-          <w:b w:val="0"/>
-        </w:rPr>
-        <w:t>Google Colab: this module, every session</w:t>
-      </w:r>
-    </w:p>
-    <w:p>
-      <w:r>
-        <w:rPr>
-          <w:b w:val="0"/>
-        </w:rPr>
-        <w:t>Colab already has most of these packages, and it forgets anything you add when the session ends. So install only this module's list, every session. The setup cell in step 5 does it for you, running the equivalent of:</w:t>
-      </w:r>
-    </w:p>
-    <w:tbl>
-      <w:tblPr>
-        <w:tblW w:type="auto" w:w="0"/>
-        <w:jc w:val="center"/>
-        <w:tblLook w:firstColumn="1" w:firstRow="1" w:lastColumn="0" w:lastRow="0" w:noHBand="0" w:noVBand="1" w:val="04A0"/>
-      </w:tblPr>
-      <w:tblGrid>
-        <w:gridCol w:w="9792"/>
-      </w:tblGrid>
-      <w:tr>
-        <w:tc>
-          <w:tcPr>
-            <w:tcW w:type="dxa" w:w="9792"/>
-            <w:shd w:val="clear" w:color="auto" w:fill="F3F5F7"/>
-            <w:tcBorders>
-              <w:top w:val="nil"/>
-              <w:left w:val="single" w:sz="36" w:color="0D1B2A"/>
-              <w:bottom w:val="nil"/>
-              <w:right w:val="nil"/>
-            </w:tcBorders>
-            <w:tcMar>
-              <w:top w:w="120" w:type="dxa"/>
-              <w:bottom w:w="120" w:type="dxa"/>
-              <w:left w:w="200" w:type="dxa"/>
-              <w:right w:w="200" w:type="dxa"/>
-            </w:tcMar>
-          </w:tcPr>
-          <w:p>
-            <w:pPr>
-              <w:spacing w:before="0" w:after="0" w:line="240" w:lineRule="auto"/>
-            </w:pPr>
-            <w:r>
-              <w:rPr>
-                <w:rFonts w:ascii="Consolas" w:hAnsi="Consolas"/>
-                <w:sz w:val="17"/>
-              </w:rPr>
-              <w:t>!pip install -q -r /content/drive/MyDrive/IT7075/04_RAG/requirements.txt</w:t>
-            </w:r>
-          </w:p>
-        </w:tc>
-      </w:tr>
-    </w:tbl>
-    <w:p>
-      <w:pPr>
-        <w:spacing w:before="0" w:after="40"/>
-      </w:pPr>
-    </w:p>
-    <w:p>
-      <w:r>
-        <w:rPr>
-          <w:b w:val="0"/>
-        </w:rPr>
-        <w:t>Red messages from "pip's dependency resolver" about other Colab packages are normal. If Colab asks you to restart the session, do so, then run the setup cell again.</w:t>
+        <w:t>. If it does, you are set up. No API key or GPU is needed: without a key, the generate step prints an offline answer.</w:t>
       </w:r>
     </w:p>
     <w:p>
@@ -2504,1708 +882,7 @@
         <w:rPr>
           <w:b w:val="0"/>
         </w:rPr>
-        <w:t>5. Add the setup cell</w:t>
-      </w:r>
-    </w:p>
-    <w:p>
-      <w:r>
-        <w:rPr>
-          <w:b w:val="0"/>
-        </w:rPr>
-        <w:t xml:space="preserve">Paste this in as the </w:t>
-      </w:r>
-      <w:r>
-        <w:rPr>
-          <w:b/>
-        </w:rPr>
-        <w:t>first cell</w:t>
-      </w:r>
-      <w:r>
-        <w:rPr>
-          <w:b w:val="0"/>
-        </w:rPr>
-        <w:t xml:space="preserve"> of the notebook (select the top cell, then </w:t>
-      </w:r>
-      <w:r>
-        <w:rPr>
-          <w:b/>
-        </w:rPr>
-        <w:t>Insert → Code cell</w:t>
-      </w:r>
-      <w:r>
-        <w:rPr>
-          <w:b w:val="0"/>
-        </w:rPr>
-        <w:t xml:space="preserve"> above it) and run it every time you open the notebook. On Colab it mounts your Drive, installs the packages, moves into the notebook's folder, and reads your API key from Colab Secrets. On Jetstream2 or your own computer it reads your key from </w:t>
-      </w:r>
-      <w:r>
-        <w:rPr>
-          <w:rFonts w:ascii="Consolas" w:hAnsi="Consolas"/>
-          <w:b w:val="0"/>
-          <w:sz w:val="19"/>
-          <w:shd w:val="clear" w:color="auto" w:fill="E8ECF0"/>
-        </w:rPr>
-        <w:t>.env</w:t>
-      </w:r>
-      <w:r>
-        <w:rPr>
-          <w:b w:val="0"/>
-        </w:rPr>
-        <w:t>. In every environment, it then checks that the notebook can find its files.</w:t>
-      </w:r>
-    </w:p>
-    <w:tbl>
-      <w:tblPr>
-        <w:tblW w:type="auto" w:w="0"/>
-        <w:jc w:val="center"/>
-        <w:tblLook w:firstColumn="1" w:firstRow="1" w:lastColumn="0" w:lastRow="0" w:noHBand="0" w:noVBand="1" w:val="04A0"/>
-      </w:tblPr>
-      <w:tblGrid>
-        <w:gridCol w:w="9792"/>
-      </w:tblGrid>
-      <w:tr>
-        <w:tc>
-          <w:tcPr>
-            <w:tcW w:type="dxa" w:w="9792"/>
-            <w:shd w:val="clear" w:color="auto" w:fill="F3F5F7"/>
-            <w:tcBorders>
-              <w:top w:val="nil"/>
-              <w:left w:val="single" w:sz="36" w:color="0D1B2A"/>
-              <w:bottom w:val="nil"/>
-              <w:right w:val="nil"/>
-            </w:tcBorders>
-            <w:tcMar>
-              <w:top w:w="120" w:type="dxa"/>
-              <w:bottom w:w="120" w:type="dxa"/>
-              <w:left w:w="200" w:type="dxa"/>
-              <w:right w:w="200" w:type="dxa"/>
-            </w:tcMar>
-          </w:tcPr>
-          <w:p>
-            <w:pPr>
-              <w:spacing w:before="0" w:after="0" w:line="240" w:lineRule="auto"/>
-            </w:pPr>
-            <w:r>
-              <w:rPr>
-                <w:rFonts w:ascii="Consolas" w:hAnsi="Consolas"/>
-                <w:sz w:val="17"/>
-              </w:rPr>
-              <w:t># ---- Setup: run this cell first, every time you open the notebook ----</w:t>
-            </w:r>
-            <w:r>
-              <w:br/>
-            </w:r>
-            <w:r>
-              <w:rPr>
-                <w:rFonts w:ascii="Consolas" w:hAnsi="Consolas"/>
-                <w:sz w:val="17"/>
-              </w:rPr>
-              <w:t>import os, sys, subprocess</w:t>
-            </w:r>
-            <w:r>
-              <w:br/>
-            </w:r>
-            <w:r>
-              <w:rPr>
-                <w:rFonts w:ascii="Consolas" w:hAnsi="Consolas"/>
-                <w:sz w:val="17"/>
-              </w:rPr>
-            </w:r>
-            <w:r>
-              <w:br/>
-            </w:r>
-            <w:r>
-              <w:rPr>
-                <w:rFonts w:ascii="Consolas" w:hAnsi="Consolas"/>
-                <w:sz w:val="17"/>
-              </w:rPr>
-              <w:t># The three settings that change from module to module:</w:t>
-            </w:r>
-            <w:r>
-              <w:br/>
-            </w:r>
-            <w:r>
-              <w:rPr>
-                <w:rFonts w:ascii="Consolas" w:hAnsi="Consolas"/>
-                <w:sz w:val="17"/>
-              </w:rPr>
-              <w:t># 1. this module's package list, inside the repository</w:t>
-            </w:r>
-            <w:r>
-              <w:br/>
-            </w:r>
-            <w:r>
-              <w:rPr>
-                <w:rFonts w:ascii="Consolas" w:hAnsi="Consolas"/>
-                <w:sz w:val="17"/>
-              </w:rPr>
-              <w:t>MODULE_REQS = "04_RAG/requirements.txt"</w:t>
-            </w:r>
-            <w:r>
-              <w:br/>
-            </w:r>
-            <w:r>
-              <w:rPr>
-                <w:rFonts w:ascii="Consolas" w:hAnsi="Consolas"/>
-                <w:sz w:val="17"/>
-              </w:rPr>
-              <w:t># 2. (Colab only) the Drive folder this notebook is in</w:t>
-            </w:r>
-            <w:r>
-              <w:br/>
-            </w:r>
-            <w:r>
-              <w:rPr>
-                <w:rFonts w:ascii="Consolas" w:hAnsi="Consolas"/>
-                <w:sz w:val="17"/>
-              </w:rPr>
-              <w:t>COLAB_FOLDER = "/content/drive/MyDrive/IT7075/04_RAG/assignments/project"</w:t>
-            </w:r>
-            <w:r>
-              <w:br/>
-            </w:r>
-            <w:r>
-              <w:rPr>
-                <w:rFonts w:ascii="Consolas" w:hAnsi="Consolas"/>
-                <w:sz w:val="17"/>
-              </w:rPr>
-              <w:t># 3. files the notebook reads, as seen from its own folder</w:t>
-            </w:r>
-            <w:r>
-              <w:br/>
-            </w:r>
-            <w:r>
-              <w:rPr>
-                <w:rFonts w:ascii="Consolas" w:hAnsi="Consolas"/>
-                <w:sz w:val="17"/>
-              </w:rPr>
-              <w:t>NEEDED = [</w:t>
-            </w:r>
-            <w:r>
-              <w:br/>
-            </w:r>
-            <w:r>
-              <w:rPr>
-                <w:rFonts w:ascii="Consolas" w:hAnsi="Consolas"/>
-                <w:sz w:val="17"/>
-              </w:rPr>
-              <w:t xml:space="preserve">    "../../code/ssrf.txt",</w:t>
-            </w:r>
-            <w:r>
-              <w:br/>
-            </w:r>
-            <w:r>
-              <w:rPr>
-                <w:rFonts w:ascii="Consolas" w:hAnsi="Consolas"/>
-                <w:sz w:val="17"/>
-              </w:rPr>
-              <w:t xml:space="preserve">    "../../code/cybersecurity_kb.md",</w:t>
-            </w:r>
-            <w:r>
-              <w:br/>
-            </w:r>
-            <w:r>
-              <w:rPr>
-                <w:rFonts w:ascii="Consolas" w:hAnsi="Consolas"/>
-                <w:sz w:val="17"/>
-              </w:rPr>
-              <w:t xml:space="preserve">    "baseline_goldset.json",</w:t>
-            </w:r>
-            <w:r>
-              <w:br/>
-            </w:r>
-            <w:r>
-              <w:rPr>
-                <w:rFonts w:ascii="Consolas" w:hAnsi="Consolas"/>
-                <w:sz w:val="17"/>
-              </w:rPr>
-              <w:t>]</w:t>
-            </w:r>
-            <w:r>
-              <w:br/>
-            </w:r>
-            <w:r>
-              <w:rPr>
-                <w:rFonts w:ascii="Consolas" w:hAnsi="Consolas"/>
-                <w:sz w:val="17"/>
-              </w:rPr>
-            </w:r>
-            <w:r>
-              <w:br/>
-            </w:r>
-            <w:r>
-              <w:rPr>
-                <w:rFonts w:ascii="Consolas" w:hAnsi="Consolas"/>
-                <w:sz w:val="17"/>
-              </w:rPr>
-              <w:t>REPO_URL = "https://github.com/li2cc/IT7075-Applied-AI-for-Cybersecurity.git"</w:t>
-            </w:r>
-            <w:r>
-              <w:br/>
-            </w:r>
-            <w:r>
-              <w:rPr>
-                <w:rFonts w:ascii="Consolas" w:hAnsi="Consolas"/>
-                <w:sz w:val="17"/>
-              </w:rPr>
-              <w:t>REPO = "/content/drive/MyDrive/IT7075"  # Colab's copy of the repository</w:t>
-            </w:r>
-            <w:r>
-              <w:br/>
-            </w:r>
-            <w:r>
-              <w:rPr>
-                <w:rFonts w:ascii="Consolas" w:hAnsi="Consolas"/>
-                <w:sz w:val="17"/>
-              </w:rPr>
-            </w:r>
-            <w:r>
-              <w:br/>
-            </w:r>
-            <w:r>
-              <w:rPr>
-                <w:rFonts w:ascii="Consolas" w:hAnsi="Consolas"/>
-                <w:sz w:val="17"/>
-              </w:rPr>
-              <w:t>if "google.colab" in sys.modules:</w:t>
-            </w:r>
-            <w:r>
-              <w:br/>
-            </w:r>
-            <w:r>
-              <w:rPr>
-                <w:rFonts w:ascii="Consolas" w:hAnsi="Consolas"/>
-                <w:sz w:val="17"/>
-              </w:rPr>
-              <w:t xml:space="preserve">    from google.colab import drive, userdata</w:t>
-            </w:r>
-            <w:r>
-              <w:br/>
-            </w:r>
-            <w:r>
-              <w:rPr>
-                <w:rFonts w:ascii="Consolas" w:hAnsi="Consolas"/>
-                <w:sz w:val="17"/>
-              </w:rPr>
-              <w:t xml:space="preserve">    drive.mount("/content/drive")</w:t>
-            </w:r>
-            <w:r>
-              <w:br/>
-            </w:r>
-            <w:r>
-              <w:rPr>
-                <w:rFonts w:ascii="Consolas" w:hAnsi="Consolas"/>
-                <w:sz w:val="17"/>
-              </w:rPr>
-              <w:t xml:space="preserve">    if not os.path.isdir(REPO):</w:t>
-            </w:r>
-            <w:r>
-              <w:br/>
-            </w:r>
-            <w:r>
-              <w:rPr>
-                <w:rFonts w:ascii="Consolas" w:hAnsi="Consolas"/>
-                <w:sz w:val="17"/>
-              </w:rPr>
-              <w:t xml:space="preserve">        subprocess.run(["git", "clone", "-q", REPO_URL, REPO], check=True)</w:t>
-            </w:r>
-            <w:r>
-              <w:br/>
-            </w:r>
-            <w:r>
-              <w:rPr>
-                <w:rFonts w:ascii="Consolas" w:hAnsi="Consolas"/>
-                <w:sz w:val="17"/>
-              </w:rPr>
-              <w:t xml:space="preserve">    subprocess.run([sys.executable, "-m", "pip", "install", "-q",</w:t>
-            </w:r>
-            <w:r>
-              <w:br/>
-            </w:r>
-            <w:r>
-              <w:rPr>
-                <w:rFonts w:ascii="Consolas" w:hAnsi="Consolas"/>
-                <w:sz w:val="17"/>
-              </w:rPr>
-              <w:t xml:space="preserve">                    "-r", os.path.join(REPO, MODULE_REQS),</w:t>
-            </w:r>
-            <w:r>
-              <w:br/>
-            </w:r>
-            <w:r>
-              <w:rPr>
-                <w:rFonts w:ascii="Consolas" w:hAnsi="Consolas"/>
-                <w:sz w:val="17"/>
-              </w:rPr>
-              <w:t xml:space="preserve">                    "-c", os.path.join(REPO, ".pip-constraints.txt")],</w:t>
-            </w:r>
-            <w:r>
-              <w:br/>
-            </w:r>
-            <w:r>
-              <w:rPr>
-                <w:rFonts w:ascii="Consolas" w:hAnsi="Consolas"/>
-                <w:sz w:val="17"/>
-              </w:rPr>
-              <w:t xml:space="preserve">                   check=True)</w:t>
-            </w:r>
-            <w:r>
-              <w:br/>
-            </w:r>
-            <w:r>
-              <w:rPr>
-                <w:rFonts w:ascii="Consolas" w:hAnsi="Consolas"/>
-                <w:sz w:val="17"/>
-              </w:rPr>
-              <w:t xml:space="preserve">    os.chdir(COLAB_FOLDER)</w:t>
-            </w:r>
-            <w:r>
-              <w:br/>
-            </w:r>
-            <w:r>
-              <w:rPr>
-                <w:rFonts w:ascii="Consolas" w:hAnsi="Consolas"/>
-                <w:sz w:val="17"/>
-              </w:rPr>
-              <w:t xml:space="preserve">    try:</w:t>
-            </w:r>
-            <w:r>
-              <w:br/>
-            </w:r>
-            <w:r>
-              <w:rPr>
-                <w:rFonts w:ascii="Consolas" w:hAnsi="Consolas"/>
-                <w:sz w:val="17"/>
-              </w:rPr>
-              <w:t xml:space="preserve">        os.environ["OPENAI_API_KEY"] = userdata.get("OPENAI_API_KEY")</w:t>
-            </w:r>
-            <w:r>
-              <w:br/>
-            </w:r>
-            <w:r>
-              <w:rPr>
-                <w:rFonts w:ascii="Consolas" w:hAnsi="Consolas"/>
-                <w:sz w:val="17"/>
-              </w:rPr>
-              <w:t xml:space="preserve">    except Exception:</w:t>
-            </w:r>
-            <w:r>
-              <w:br/>
-            </w:r>
-            <w:r>
-              <w:rPr>
-                <w:rFonts w:ascii="Consolas" w:hAnsi="Consolas"/>
-                <w:sz w:val="17"/>
-              </w:rPr>
-              <w:t xml:space="preserve">        print("No OPENAI_API_KEY in Colab Secrets (fine if not needed).")</w:t>
-            </w:r>
-            <w:r>
-              <w:br/>
-            </w:r>
-            <w:r>
-              <w:rPr>
-                <w:rFonts w:ascii="Consolas" w:hAnsi="Consolas"/>
-                <w:sz w:val="17"/>
-              </w:rPr>
-              <w:t>else:</w:t>
-            </w:r>
-            <w:r>
-              <w:br/>
-            </w:r>
-            <w:r>
-              <w:rPr>
-                <w:rFonts w:ascii="Consolas" w:hAnsi="Consolas"/>
-                <w:sz w:val="17"/>
-              </w:rPr>
-              <w:t xml:space="preserve">    # Jetstream2 or your own computer: packages are in .venv (step 4).</w:t>
-            </w:r>
-            <w:r>
-              <w:br/>
-            </w:r>
-            <w:r>
-              <w:rPr>
-                <w:rFonts w:ascii="Consolas" w:hAnsi="Consolas"/>
-                <w:sz w:val="17"/>
-              </w:rPr>
-              <w:t xml:space="preserve">    # Read the API key from the .env file in your IT7075 folder, if any.</w:t>
-            </w:r>
-            <w:r>
-              <w:br/>
-            </w:r>
-            <w:r>
-              <w:rPr>
-                <w:rFonts w:ascii="Consolas" w:hAnsi="Consolas"/>
-                <w:sz w:val="17"/>
-              </w:rPr>
-              <w:t xml:space="preserve">    try:</w:t>
-            </w:r>
-            <w:r>
-              <w:br/>
-            </w:r>
-            <w:r>
-              <w:rPr>
-                <w:rFonts w:ascii="Consolas" w:hAnsi="Consolas"/>
-                <w:sz w:val="17"/>
-              </w:rPr>
-              <w:t xml:space="preserve">        from dotenv import load_dotenv, find_dotenv</w:t>
-            </w:r>
-            <w:r>
-              <w:br/>
-            </w:r>
-            <w:r>
-              <w:rPr>
-                <w:rFonts w:ascii="Consolas" w:hAnsi="Consolas"/>
-                <w:sz w:val="17"/>
-              </w:rPr>
-              <w:t xml:space="preserve">        load_dotenv(find_dotenv(usecwd=True))</w:t>
-            </w:r>
-            <w:r>
-              <w:br/>
-            </w:r>
-            <w:r>
-              <w:rPr>
-                <w:rFonts w:ascii="Consolas" w:hAnsi="Consolas"/>
-                <w:sz w:val="17"/>
-              </w:rPr>
-              <w:t xml:space="preserve">    except ImportError:</w:t>
-            </w:r>
-            <w:r>
-              <w:br/>
-            </w:r>
-            <w:r>
-              <w:rPr>
-                <w:rFonts w:ascii="Consolas" w:hAnsi="Consolas"/>
-                <w:sz w:val="17"/>
-              </w:rPr>
-              <w:t xml:space="preserve">        pass</w:t>
-            </w:r>
-            <w:r>
-              <w:br/>
-            </w:r>
-            <w:r>
-              <w:rPr>
-                <w:rFonts w:ascii="Consolas" w:hAnsi="Consolas"/>
-                <w:sz w:val="17"/>
-              </w:rPr>
-            </w:r>
-            <w:r>
-              <w:br/>
-            </w:r>
-            <w:r>
-              <w:rPr>
-                <w:rFonts w:ascii="Consolas" w:hAnsi="Consolas"/>
-                <w:sz w:val="17"/>
-              </w:rPr>
-              <w:t>print("Working folder:", os.getcwd())</w:t>
-            </w:r>
-            <w:r>
-              <w:br/>
-            </w:r>
-            <w:r>
-              <w:rPr>
-                <w:rFonts w:ascii="Consolas" w:hAnsi="Consolas"/>
-                <w:sz w:val="17"/>
-              </w:rPr>
-              <w:t>missing = [f for f in NEEDED if not os.path.exists(f)]</w:t>
-            </w:r>
-            <w:r>
-              <w:br/>
-            </w:r>
-            <w:r>
-              <w:rPr>
-                <w:rFonts w:ascii="Consolas" w:hAnsi="Consolas"/>
-                <w:sz w:val="17"/>
-              </w:rPr>
-              <w:t>if missing:</w:t>
-            </w:r>
-            <w:r>
-              <w:br/>
-            </w:r>
-            <w:r>
-              <w:rPr>
-                <w:rFonts w:ascii="Consolas" w:hAnsi="Consolas"/>
-                <w:sz w:val="17"/>
-              </w:rPr>
-              <w:t xml:space="preserve">    raise FileNotFoundError(f"Not found from this folder: {missing}. "</w:t>
-            </w:r>
-            <w:r>
-              <w:br/>
-            </w:r>
-            <w:r>
-              <w:rPr>
-                <w:rFonts w:ascii="Consolas" w:hAnsi="Consolas"/>
-                <w:sz w:val="17"/>
-              </w:rPr>
-              <w:t xml:space="preserve">                            "See step 6 of the setup guide.")</w:t>
-            </w:r>
-            <w:r>
-              <w:br/>
-            </w:r>
-            <w:r>
-              <w:rPr>
-                <w:rFonts w:ascii="Consolas" w:hAnsi="Consolas"/>
-                <w:sz w:val="17"/>
-              </w:rPr>
-              <w:t>print("All course files found. You are ready to go.")</w:t>
-            </w:r>
-          </w:p>
-        </w:tc>
-      </w:tr>
-    </w:tbl>
-    <w:p>
-      <w:pPr>
-        <w:spacing w:before="0" w:after="40"/>
-      </w:pPr>
-    </w:p>
-    <w:p>
-      <w:r>
-        <w:rPr>
-          <w:b w:val="0"/>
-        </w:rPr>
-        <w:t xml:space="preserve">It should end with </w:t>
-      </w:r>
-      <w:r>
-        <w:rPr>
-          <w:b/>
-        </w:rPr>
-        <w:t>All course files found. You are ready to go.</w:t>
-      </w:r>
-      <w:r>
-        <w:rPr>
-          <w:b w:val="0"/>
-        </w:rPr>
-        <w:t xml:space="preserve"> If it raises </w:t>
-      </w:r>
-      <w:r>
-        <w:rPr>
-          <w:rFonts w:ascii="Consolas" w:hAnsi="Consolas"/>
-          <w:b w:val="0"/>
-          <w:sz w:val="19"/>
-          <w:shd w:val="clear" w:color="auto" w:fill="E8ECF0"/>
-        </w:rPr>
-        <w:t>FileNotFoundError</w:t>
-      </w:r>
-      <w:r>
-        <w:rPr>
-          <w:b w:val="0"/>
-        </w:rPr>
-        <w:t>, go to step 6.</w:t>
-      </w:r>
-    </w:p>
-    <w:tbl>
-      <w:tblPr>
-        <w:tblW w:type="auto" w:w="0"/>
-        <w:jc w:val="center"/>
-        <w:tblLook w:firstColumn="1" w:firstRow="1" w:lastColumn="0" w:lastRow="0" w:noHBand="0" w:noVBand="1" w:val="04A0"/>
-      </w:tblPr>
-      <w:tblGrid>
-        <w:gridCol w:w="9792"/>
-      </w:tblGrid>
-      <w:tr>
-        <w:tc>
-          <w:tcPr>
-            <w:tcW w:type="dxa" w:w="9792"/>
-            <w:shd w:val="clear" w:color="auto" w:fill="F3F5F7"/>
-            <w:tcBorders>
-              <w:top w:val="nil"/>
-              <w:left w:val="single" w:sz="36" w:color="A3122A"/>
-              <w:bottom w:val="nil"/>
-              <w:right w:val="nil"/>
-            </w:tcBorders>
-            <w:tcMar>
-              <w:top w:w="120" w:type="dxa"/>
-              <w:bottom w:w="120" w:type="dxa"/>
-              <w:left w:w="200" w:type="dxa"/>
-              <w:right w:w="200" w:type="dxa"/>
-            </w:tcMar>
-          </w:tcPr>
-          <w:p>
-            <w:pPr>
-              <w:spacing w:before="0" w:after="60"/>
-            </w:pPr>
-            <w:r>
-              <w:rPr>
-                <w:b/>
-              </w:rPr>
-              <w:t>API keys</w:t>
-            </w:r>
-          </w:p>
-          <w:p>
-            <w:pPr>
-              <w:spacing w:before="0" w:after="0"/>
-            </w:pPr>
-            <w:r>
-              <w:rPr>
-                <w:b w:val="0"/>
-              </w:rPr>
-              <w:t xml:space="preserve">Never type a key into a notebook cell: saved outputs and GitHub history keep it. </w:t>
-            </w:r>
-            <w:r>
-              <w:rPr>
-                <w:b/>
-              </w:rPr>
-              <w:t>On Colab</w:t>
-            </w:r>
-            <w:r>
-              <w:rPr>
-                <w:b w:val="0"/>
-              </w:rPr>
-              <w:t xml:space="preserve">, click the key icon in the left sidebar, add a secret named </w:t>
-            </w:r>
-            <w:r>
-              <w:rPr>
-                <w:rFonts w:ascii="Consolas" w:hAnsi="Consolas"/>
-                <w:b w:val="0"/>
-                <w:sz w:val="19"/>
-                <w:shd w:val="clear" w:color="auto" w:fill="E8ECF0"/>
-              </w:rPr>
-              <w:t>OPENAI_API_KEY</w:t>
-            </w:r>
-            <w:r>
-              <w:rPr>
-                <w:b w:val="0"/>
-              </w:rPr>
-              <w:t xml:space="preserve">, and turn on </w:t>
-            </w:r>
-            <w:r>
-              <w:rPr>
-                <w:b/>
-              </w:rPr>
-              <w:t>Notebook access</w:t>
-            </w:r>
-            <w:r>
-              <w:rPr>
-                <w:b w:val="0"/>
-              </w:rPr>
-              <w:t xml:space="preserve">. </w:t>
-            </w:r>
-            <w:r>
-              <w:rPr>
-                <w:b/>
-              </w:rPr>
-              <w:t>Elsewhere</w:t>
-            </w:r>
-            <w:r>
-              <w:rPr>
-                <w:b w:val="0"/>
-              </w:rPr>
-              <w:t xml:space="preserve">, put the line </w:t>
-            </w:r>
-            <w:r>
-              <w:rPr>
-                <w:rFonts w:ascii="Consolas" w:hAnsi="Consolas"/>
-                <w:b w:val="0"/>
-                <w:sz w:val="19"/>
-                <w:shd w:val="clear" w:color="auto" w:fill="E8ECF0"/>
-              </w:rPr>
-              <w:t>OPENAI_API_KEY=sk-...</w:t>
-            </w:r>
-            <w:r>
-              <w:rPr>
-                <w:b w:val="0"/>
-              </w:rPr>
-              <w:t xml:space="preserve"> in a file named </w:t>
-            </w:r>
-            <w:r>
-              <w:rPr>
-                <w:rFonts w:ascii="Consolas" w:hAnsi="Consolas"/>
-                <w:b w:val="0"/>
-                <w:sz w:val="19"/>
-                <w:shd w:val="clear" w:color="auto" w:fill="E8ECF0"/>
-              </w:rPr>
-              <w:t>.env</w:t>
-            </w:r>
-            <w:r>
-              <w:rPr>
-                <w:b w:val="0"/>
-              </w:rPr>
-              <w:t xml:space="preserve"> in the </w:t>
-            </w:r>
-            <w:r>
-              <w:rPr>
-                <w:rFonts w:ascii="Consolas" w:hAnsi="Consolas"/>
-                <w:b w:val="0"/>
-                <w:sz w:val="19"/>
-                <w:shd w:val="clear" w:color="auto" w:fill="E8ECF0"/>
-              </w:rPr>
-              <w:t>IT7075</w:t>
-            </w:r>
-            <w:r>
-              <w:rPr>
-                <w:b w:val="0"/>
-              </w:rPr>
-              <w:t xml:space="preserve"> folder. The repository's </w:t>
-            </w:r>
-            <w:r>
-              <w:rPr>
-                <w:rFonts w:ascii="Consolas" w:hAnsi="Consolas"/>
-                <w:b w:val="0"/>
-                <w:sz w:val="19"/>
-                <w:shd w:val="clear" w:color="auto" w:fill="E8ECF0"/>
-              </w:rPr>
-              <w:t>.gitignore</w:t>
-            </w:r>
-            <w:r>
-              <w:rPr>
-                <w:b w:val="0"/>
-              </w:rPr>
-              <w:t xml:space="preserve"> keeps </w:t>
-            </w:r>
-            <w:r>
-              <w:rPr>
-                <w:rFonts w:ascii="Consolas" w:hAnsi="Consolas"/>
-                <w:b w:val="0"/>
-                <w:sz w:val="19"/>
-                <w:shd w:val="clear" w:color="auto" w:fill="E8ECF0"/>
-              </w:rPr>
-              <w:t>.env</w:t>
-            </w:r>
-            <w:r>
-              <w:rPr>
-                <w:b w:val="0"/>
-              </w:rPr>
-              <w:t xml:space="preserve"> out of Git.</w:t>
-            </w:r>
-          </w:p>
-        </w:tc>
-      </w:tr>
-    </w:tbl>
-    <w:p>
-      <w:pPr>
-        <w:spacing w:before="0" w:after="40"/>
-      </w:pPr>
-    </w:p>
-    <w:p>
-      <w:pPr>
-        <w:pStyle w:val="Heading2"/>
-        <w:keepNext/>
-        <w:pBdr>
-          <w:bottom w:val="single" w:sz="18" w:space="3" w:color="A3122A"/>
-        </w:pBdr>
-        <w:spacing w:before="280" w:after="120"/>
-      </w:pPr>
-      <w:r>
-        <w:rPr>
-          <w:b w:val="0"/>
-        </w:rPr>
-        <w:t>6. Check your paths</w:t>
-      </w:r>
-    </w:p>
-    <w:p>
-      <w:r>
-        <w:rPr>
-          <w:b w:val="0"/>
-        </w:rPr>
-        <w:t xml:space="preserve">If the setup cell reports missing files, or a later cell raises </w:t>
-      </w:r>
-      <w:r>
-        <w:rPr>
-          <w:rFonts w:ascii="Consolas" w:hAnsi="Consolas"/>
-          <w:b w:val="0"/>
-          <w:sz w:val="19"/>
-          <w:shd w:val="clear" w:color="auto" w:fill="E8ECF0"/>
-        </w:rPr>
-        <w:t>FileNotFoundError</w:t>
-      </w:r>
-      <w:r>
-        <w:rPr>
-          <w:b w:val="0"/>
-        </w:rPr>
-        <w:t xml:space="preserve">, the notebook is running from the wrong folder. Look at the </w:t>
-      </w:r>
-      <w:r>
-        <w:rPr>
-          <w:b/>
-        </w:rPr>
-        <w:t>Working folder</w:t>
-      </w:r>
-      <w:r>
-        <w:rPr>
-          <w:b w:val="0"/>
-        </w:rPr>
-        <w:t xml:space="preserve"> line the setup cell printed:</w:t>
-      </w:r>
-    </w:p>
-    <w:tbl>
-      <w:tblPr>
-        <w:tblW w:type="auto" w:w="0"/>
-        <w:jc w:val="center"/>
-        <w:tblLook w:firstColumn="1" w:firstRow="1" w:lastColumn="0" w:lastRow="0" w:noHBand="0" w:noVBand="1" w:val="04A0"/>
-      </w:tblPr>
-      <w:tblGrid>
-        <w:gridCol w:w="4896"/>
-        <w:gridCol w:w="4896"/>
-      </w:tblGrid>
-      <w:tr>
-        <w:trPr>
-          <w:tblHeader w:val="true"/>
-        </w:trPr>
-        <w:tc>
-          <w:tcPr>
-            <w:tcW w:type="dxa" w:w="3525"/>
-            <w:tcBorders>
-              <w:top w:val="single" w:sz="4" w:color="C9D2DC"/>
-              <w:left w:val="single" w:sz="4" w:color="C9D2DC"/>
-              <w:bottom w:val="single" w:sz="4" w:color="C9D2DC"/>
-              <w:right w:val="single" w:sz="4" w:color="C9D2DC"/>
-            </w:tcBorders>
-            <w:tcMar>
-              <w:top w:w="60" w:type="dxa"/>
-              <w:bottom w:w="60" w:type="dxa"/>
-              <w:left w:w="110" w:type="dxa"/>
-              <w:right w:w="110" w:type="dxa"/>
-            </w:tcMar>
-            <w:shd w:val="clear" w:color="auto" w:fill="0D1B2A"/>
-          </w:tcPr>
-          <w:p>
-            <w:pPr>
-              <w:spacing w:before="0" w:after="0"/>
-            </w:pPr>
-            <w:r>
-              <w:rPr>
-                <w:b/>
-                <w:color w:val="FFFFFF"/>
-              </w:rPr>
-              <w:t>Working folder printed</w:t>
-            </w:r>
-          </w:p>
-        </w:tc>
-        <w:tc>
-          <w:tcPr>
-            <w:tcW w:type="dxa" w:w="6267"/>
-            <w:tcBorders>
-              <w:top w:val="single" w:sz="4" w:color="C9D2DC"/>
-              <w:left w:val="single" w:sz="4" w:color="C9D2DC"/>
-              <w:bottom w:val="single" w:sz="4" w:color="C9D2DC"/>
-              <w:right w:val="single" w:sz="4" w:color="C9D2DC"/>
-            </w:tcBorders>
-            <w:tcMar>
-              <w:top w:w="60" w:type="dxa"/>
-              <w:bottom w:w="60" w:type="dxa"/>
-              <w:left w:w="110" w:type="dxa"/>
-              <w:right w:w="110" w:type="dxa"/>
-            </w:tcMar>
-            <w:shd w:val="clear" w:color="auto" w:fill="0D1B2A"/>
-          </w:tcPr>
-          <w:p>
-            <w:pPr>
-              <w:spacing w:before="0" w:after="0"/>
-            </w:pPr>
-            <w:r>
-              <w:rPr>
-                <w:b/>
-                <w:color w:val="FFFFFF"/>
-              </w:rPr>
-              <w:t>What it means</w:t>
-            </w:r>
-          </w:p>
-        </w:tc>
-      </w:tr>
-      <w:tr>
-        <w:tc>
-          <w:tcPr>
-            <w:tcW w:type="dxa" w:w="3525"/>
-            <w:tcBorders>
-              <w:top w:val="single" w:sz="4" w:color="C9D2DC"/>
-              <w:left w:val="single" w:sz="4" w:color="C9D2DC"/>
-              <w:bottom w:val="single" w:sz="4" w:color="C9D2DC"/>
-              <w:right w:val="single" w:sz="4" w:color="C9D2DC"/>
-            </w:tcBorders>
-            <w:tcMar>
-              <w:top w:w="60" w:type="dxa"/>
-              <w:bottom w:w="60" w:type="dxa"/>
-              <w:left w:w="110" w:type="dxa"/>
-              <w:right w:w="110" w:type="dxa"/>
-            </w:tcMar>
-          </w:tcPr>
-          <w:p>
-            <w:pPr>
-              <w:spacing w:before="0" w:after="0"/>
-            </w:pPr>
-            <w:r>
-              <w:rPr>
-                <w:rFonts w:ascii="Consolas" w:hAnsi="Consolas"/>
-                <w:b w:val="0"/>
-                <w:sz w:val="19"/>
-                <w:shd w:val="clear" w:color="auto" w:fill="E8ECF0"/>
-              </w:rPr>
-              <w:t>.../IT7075/04_RAG/assignments/project</w:t>
-            </w:r>
-          </w:p>
-        </w:tc>
-        <w:tc>
-          <w:tcPr>
-            <w:tcW w:type="dxa" w:w="6267"/>
-            <w:tcBorders>
-              <w:top w:val="single" w:sz="4" w:color="C9D2DC"/>
-              <w:left w:val="single" w:sz="4" w:color="C9D2DC"/>
-              <w:bottom w:val="single" w:sz="4" w:color="C9D2DC"/>
-              <w:right w:val="single" w:sz="4" w:color="C9D2DC"/>
-            </w:tcBorders>
-            <w:tcMar>
-              <w:top w:w="60" w:type="dxa"/>
-              <w:bottom w:w="60" w:type="dxa"/>
-              <w:left w:w="110" w:type="dxa"/>
-              <w:right w:w="110" w:type="dxa"/>
-            </w:tcMar>
-          </w:tcPr>
-          <w:p>
-            <w:pPr>
-              <w:spacing w:before="0" w:after="0"/>
-            </w:pPr>
-            <w:r>
-              <w:rPr>
-                <w:b w:val="0"/>
-              </w:rPr>
-              <w:t xml:space="preserve">The folder is right, so a file is missing. Run </w:t>
-            </w:r>
-            <w:r>
-              <w:rPr>
-                <w:rFonts w:ascii="Consolas" w:hAnsi="Consolas"/>
-                <w:b w:val="0"/>
-                <w:sz w:val="19"/>
-                <w:shd w:val="clear" w:color="auto" w:fill="E8ECF0"/>
-              </w:rPr>
-              <w:t>git status</w:t>
-            </w:r>
-            <w:r>
-              <w:rPr>
-                <w:b w:val="0"/>
-              </w:rPr>
-              <w:t xml:space="preserve"> in the </w:t>
-            </w:r>
-            <w:r>
-              <w:rPr>
-                <w:rFonts w:ascii="Consolas" w:hAnsi="Consolas"/>
-                <w:b w:val="0"/>
-                <w:sz w:val="19"/>
-                <w:shd w:val="clear" w:color="auto" w:fill="E8ECF0"/>
-              </w:rPr>
-              <w:t>IT7075</w:t>
-            </w:r>
-            <w:r>
-              <w:rPr>
-                <w:b w:val="0"/>
-              </w:rPr>
-              <w:t xml:space="preserve"> folder to see whether one was deleted or moved, or clone the repository again.</w:t>
-            </w:r>
-          </w:p>
-        </w:tc>
-      </w:tr>
-      <w:tr>
-        <w:tc>
-          <w:tcPr>
-            <w:tcW w:type="dxa" w:w="3525"/>
-            <w:tcBorders>
-              <w:top w:val="single" w:sz="4" w:color="C9D2DC"/>
-              <w:left w:val="single" w:sz="4" w:color="C9D2DC"/>
-              <w:bottom w:val="single" w:sz="4" w:color="C9D2DC"/>
-              <w:right w:val="single" w:sz="4" w:color="C9D2DC"/>
-            </w:tcBorders>
-            <w:tcMar>
-              <w:top w:w="60" w:type="dxa"/>
-              <w:bottom w:w="60" w:type="dxa"/>
-              <w:left w:w="110" w:type="dxa"/>
-              <w:right w:w="110" w:type="dxa"/>
-            </w:tcMar>
-          </w:tcPr>
-          <w:p>
-            <w:pPr>
-              <w:spacing w:before="0" w:after="0"/>
-            </w:pPr>
-            <w:r>
-              <w:rPr>
-                <w:rFonts w:ascii="Consolas" w:hAnsi="Consolas"/>
-                <w:b w:val="0"/>
-                <w:sz w:val="19"/>
-                <w:shd w:val="clear" w:color="auto" w:fill="E8ECF0"/>
-              </w:rPr>
-              <w:t>/content</w:t>
-            </w:r>
-          </w:p>
-        </w:tc>
-        <w:tc>
-          <w:tcPr>
-            <w:tcW w:type="dxa" w:w="6267"/>
-            <w:tcBorders>
-              <w:top w:val="single" w:sz="4" w:color="C9D2DC"/>
-              <w:left w:val="single" w:sz="4" w:color="C9D2DC"/>
-              <w:bottom w:val="single" w:sz="4" w:color="C9D2DC"/>
-              <w:right w:val="single" w:sz="4" w:color="C9D2DC"/>
-            </w:tcBorders>
-            <w:tcMar>
-              <w:top w:w="60" w:type="dxa"/>
-              <w:bottom w:w="60" w:type="dxa"/>
-              <w:left w:w="110" w:type="dxa"/>
-              <w:right w:w="110" w:type="dxa"/>
-            </w:tcMar>
-          </w:tcPr>
-          <w:p>
-            <w:pPr>
-              <w:spacing w:before="0" w:after="0"/>
-            </w:pPr>
-            <w:r>
-              <w:rPr>
-                <w:b w:val="0"/>
-              </w:rPr>
-              <w:t>Colab, with a notebook opened from GitHub or uploaded on its own. Open it from Drive (step 3A) and run the setup cell.</w:t>
-            </w:r>
-          </w:p>
-        </w:tc>
-      </w:tr>
-      <w:tr>
-        <w:tc>
-          <w:tcPr>
-            <w:tcW w:type="dxa" w:w="3525"/>
-            <w:tcBorders>
-              <w:top w:val="single" w:sz="4" w:color="C9D2DC"/>
-              <w:left w:val="single" w:sz="4" w:color="C9D2DC"/>
-              <w:bottom w:val="single" w:sz="4" w:color="C9D2DC"/>
-              <w:right w:val="single" w:sz="4" w:color="C9D2DC"/>
-            </w:tcBorders>
-            <w:tcMar>
-              <w:top w:w="60" w:type="dxa"/>
-              <w:bottom w:w="60" w:type="dxa"/>
-              <w:left w:w="110" w:type="dxa"/>
-              <w:right w:w="110" w:type="dxa"/>
-            </w:tcMar>
-          </w:tcPr>
-          <w:p>
-            <w:pPr>
-              <w:spacing w:before="0" w:after="0"/>
-            </w:pPr>
-            <w:r>
-              <w:rPr>
-                <w:b w:val="0"/>
-              </w:rPr>
-              <w:t>Anywhere else</w:t>
-            </w:r>
-          </w:p>
-        </w:tc>
-        <w:tc>
-          <w:tcPr>
-            <w:tcW w:type="dxa" w:w="6267"/>
-            <w:tcBorders>
-              <w:top w:val="single" w:sz="4" w:color="C9D2DC"/>
-              <w:left w:val="single" w:sz="4" w:color="C9D2DC"/>
-              <w:bottom w:val="single" w:sz="4" w:color="C9D2DC"/>
-              <w:right w:val="single" w:sz="4" w:color="C9D2DC"/>
-            </w:tcBorders>
-            <w:tcMar>
-              <w:top w:w="60" w:type="dxa"/>
-              <w:bottom w:w="60" w:type="dxa"/>
-              <w:left w:w="110" w:type="dxa"/>
-              <w:right w:w="110" w:type="dxa"/>
-            </w:tcMar>
-          </w:tcPr>
-          <w:p>
-            <w:pPr>
-              <w:spacing w:before="0" w:after="0"/>
-            </w:pPr>
-            <w:r>
-              <w:rPr>
-                <w:b w:val="0"/>
-              </w:rPr>
-              <w:t xml:space="preserve">You are running a moved or downloaded copy of the notebook. Open the one inside </w:t>
-            </w:r>
-            <w:r>
-              <w:rPr>
-                <w:rFonts w:ascii="Consolas" w:hAnsi="Consolas"/>
-                <w:b w:val="0"/>
-                <w:sz w:val="19"/>
-                <w:shd w:val="clear" w:color="auto" w:fill="E8ECF0"/>
-              </w:rPr>
-              <w:t>IT7075/04_RAG/assignments/project</w:t>
-            </w:r>
-            <w:r>
-              <w:rPr>
-                <w:b w:val="0"/>
-              </w:rPr>
-              <w:t>.</w:t>
-            </w:r>
-          </w:p>
-        </w:tc>
-      </w:tr>
-    </w:tbl>
-    <w:p>
-      <w:pPr>
-        <w:spacing w:before="0" w:after="40"/>
-      </w:pPr>
-    </w:p>
-    <w:p>
-      <w:r>
-        <w:rPr>
-          <w:b w:val="0"/>
-        </w:rPr>
-        <w:t>To see exactly what the notebook sees, run this in a cell:</w:t>
-      </w:r>
-    </w:p>
-    <w:tbl>
-      <w:tblPr>
-        <w:tblW w:type="auto" w:w="0"/>
-        <w:jc w:val="center"/>
-        <w:tblLook w:firstColumn="1" w:firstRow="1" w:lastColumn="0" w:lastRow="0" w:noHBand="0" w:noVBand="1" w:val="04A0"/>
-      </w:tblPr>
-      <w:tblGrid>
-        <w:gridCol w:w="9792"/>
-      </w:tblGrid>
-      <w:tr>
-        <w:tc>
-          <w:tcPr>
-            <w:tcW w:type="dxa" w:w="9792"/>
-            <w:shd w:val="clear" w:color="auto" w:fill="F3F5F7"/>
-            <w:tcBorders>
-              <w:top w:val="nil"/>
-              <w:left w:val="single" w:sz="36" w:color="0D1B2A"/>
-              <w:bottom w:val="nil"/>
-              <w:right w:val="nil"/>
-            </w:tcBorders>
-            <w:tcMar>
-              <w:top w:w="120" w:type="dxa"/>
-              <w:bottom w:w="120" w:type="dxa"/>
-              <w:left w:w="200" w:type="dxa"/>
-              <w:right w:w="200" w:type="dxa"/>
-            </w:tcMar>
-          </w:tcPr>
-          <w:p>
-            <w:pPr>
-              <w:spacing w:before="0" w:after="0" w:line="240" w:lineRule="auto"/>
-            </w:pPr>
-            <w:r>
-              <w:rPr>
-                <w:rFonts w:ascii="Consolas" w:hAnsi="Consolas"/>
-                <w:sz w:val="17"/>
-              </w:rPr>
-              <w:t>import os</w:t>
-            </w:r>
-            <w:r>
-              <w:br/>
-            </w:r>
-            <w:r>
-              <w:rPr>
-                <w:rFonts w:ascii="Consolas" w:hAnsi="Consolas"/>
-                <w:sz w:val="17"/>
-              </w:rPr>
-              <w:t>print(os.getcwd())</w:t>
-            </w:r>
-            <w:r>
-              <w:br/>
-            </w:r>
-            <w:r>
-              <w:rPr>
-                <w:rFonts w:ascii="Consolas" w:hAnsi="Consolas"/>
-                <w:sz w:val="17"/>
-              </w:rPr>
-              <w:t>print(os.listdir("."))</w:t>
-            </w:r>
-          </w:p>
-        </w:tc>
-      </w:tr>
-    </w:tbl>
-    <w:p>
-      <w:pPr>
-        <w:spacing w:before="0" w:after="40"/>
-      </w:pPr>
-    </w:p>
-    <w:p>
-      <w:pPr>
-        <w:pStyle w:val="Heading2"/>
-        <w:keepNext/>
-        <w:pBdr>
-          <w:bottom w:val="single" w:sz="18" w:space="3" w:color="A3122A"/>
-        </w:pBdr>
-        <w:spacing w:before="280" w:after="120"/>
-      </w:pPr>
-      <w:r>
-        <w:rPr>
-          <w:b w:val="0"/>
-        </w:rPr>
-        <w:t>7. Submit from your own private repository</w:t>
-      </w:r>
-    </w:p>
-    <w:p>
-      <w:r>
-        <w:rPr>
-          <w:b w:val="0"/>
-        </w:rPr>
-        <w:t xml:space="preserve">The project brief asks for a </w:t>
-      </w:r>
-      <w:r>
-        <w:rPr>
-          <w:b/>
-        </w:rPr>
-        <w:t>private</w:t>
-      </w:r>
-      <w:r>
-        <w:rPr>
-          <w:b w:val="0"/>
-        </w:rPr>
-        <w:t xml:space="preserve"> GitHub repository, with your instructor and the TA added as collaborators, that holds your work in a </w:t>
-      </w:r>
-      <w:r>
-        <w:rPr>
-          <w:rFonts w:ascii="Consolas" w:hAnsi="Consolas"/>
-          <w:b w:val="0"/>
-          <w:sz w:val="19"/>
-          <w:shd w:val="clear" w:color="auto" w:fill="E8ECF0"/>
-        </w:rPr>
-        <w:t>rag_project/</w:t>
-      </w:r>
-      <w:r>
-        <w:rPr>
-          <w:b w:val="0"/>
-        </w:rPr>
-        <w:t xml:space="preserve"> folder. </w:t>
-      </w:r>
-      <w:r>
-        <w:rPr>
-          <w:b/>
-        </w:rPr>
-        <w:t>Do not fork the course repository</w:t>
-      </w:r>
-      <w:r>
-        <w:rPr>
-          <w:b w:val="0"/>
-        </w:rPr>
-        <w:t>: a fork of a public repository is public, so everyone could see your work.</w:t>
-      </w:r>
-    </w:p>
-    <w:p>
-      <w:pPr>
-        <w:tabs>
-          <w:tab w:pos="504" w:val="left"/>
-        </w:tabs>
-        <w:spacing w:before="0" w:after="80"/>
-        <w:ind w:left="504" w:hanging="360"/>
-      </w:pPr>
-      <w:r>
-        <w:t>1.</w:t>
-        <w:tab/>
-      </w:r>
-      <w:r>
-        <w:rPr>
-          <w:b w:val="0"/>
-        </w:rPr>
-        <w:t xml:space="preserve">On GitHub, click </w:t>
-      </w:r>
-      <w:r>
-        <w:rPr>
-          <w:b/>
-        </w:rPr>
-        <w:t>New repository</w:t>
-      </w:r>
-      <w:r>
-        <w:rPr>
-          <w:b w:val="0"/>
-        </w:rPr>
-        <w:t xml:space="preserve">, choose </w:t>
-      </w:r>
-      <w:r>
-        <w:rPr>
-          <w:b/>
-        </w:rPr>
-        <w:t>Private</w:t>
-      </w:r>
-      <w:r>
-        <w:rPr>
-          <w:b w:val="0"/>
-        </w:rPr>
-        <w:t xml:space="preserve">, and tick </w:t>
-      </w:r>
-      <w:r>
-        <w:rPr>
-          <w:b/>
-        </w:rPr>
-        <w:t>Add a README</w:t>
-      </w:r>
-      <w:r>
-        <w:rPr>
-          <w:b w:val="0"/>
-        </w:rPr>
-        <w:t xml:space="preserve">. Then open </w:t>
-      </w:r>
-      <w:r>
-        <w:rPr>
-          <w:b/>
-        </w:rPr>
-        <w:t>Settings → Collaborators</w:t>
-      </w:r>
-      <w:r>
-        <w:rPr>
-          <w:b w:val="0"/>
-        </w:rPr>
-        <w:t xml:space="preserve"> and add your instructor and the TA.</w:t>
-      </w:r>
-    </w:p>
-    <w:p>
-      <w:pPr>
-        <w:tabs>
-          <w:tab w:pos="504" w:val="left"/>
-        </w:tabs>
-        <w:spacing w:before="0" w:after="80"/>
-        <w:ind w:left="504" w:hanging="360"/>
-      </w:pPr>
-      <w:r>
-        <w:t>2.</w:t>
-        <w:tab/>
-      </w:r>
-      <w:r>
-        <w:rPr>
-          <w:b w:val="0"/>
-        </w:rPr>
-        <w:t xml:space="preserve">In that repository, make a </w:t>
-      </w:r>
-      <w:r>
-        <w:rPr>
-          <w:rFonts w:ascii="Consolas" w:hAnsi="Consolas"/>
-          <w:b w:val="0"/>
-          <w:sz w:val="19"/>
-          <w:shd w:val="clear" w:color="auto" w:fill="E8ECF0"/>
-        </w:rPr>
-        <w:t>rag_project/</w:t>
-      </w:r>
-      <w:r>
-        <w:rPr>
-          <w:b w:val="0"/>
-        </w:rPr>
-        <w:t xml:space="preserve"> folder. Copy your finished notebook into it as </w:t>
-      </w:r>
-      <w:r>
-        <w:rPr>
-          <w:rFonts w:ascii="Consolas" w:hAnsi="Consolas"/>
-          <w:b w:val="0"/>
-          <w:sz w:val="19"/>
-          <w:shd w:val="clear" w:color="auto" w:fill="E8ECF0"/>
-        </w:rPr>
-        <w:t>rag_notebook.ipynb</w:t>
-      </w:r>
-      <w:r>
-        <w:rPr>
-          <w:b w:val="0"/>
-        </w:rPr>
-        <w:t xml:space="preserve">, and copy the three practice files next to it: </w:t>
-      </w:r>
-      <w:r>
-        <w:rPr>
-          <w:rFonts w:ascii="Consolas" w:hAnsi="Consolas"/>
-          <w:b w:val="0"/>
-          <w:sz w:val="19"/>
-          <w:shd w:val="clear" w:color="auto" w:fill="E8ECF0"/>
-        </w:rPr>
-        <w:t>ssrf.txt</w:t>
-      </w:r>
-      <w:r>
-        <w:rPr>
-          <w:b w:val="0"/>
-        </w:rPr>
-        <w:t xml:space="preserve">, </w:t>
-      </w:r>
-      <w:r>
-        <w:rPr>
-          <w:rFonts w:ascii="Consolas" w:hAnsi="Consolas"/>
-          <w:b w:val="0"/>
-          <w:sz w:val="19"/>
-          <w:shd w:val="clear" w:color="auto" w:fill="E8ECF0"/>
-        </w:rPr>
-        <w:t>cybersecurity_kb.md</w:t>
-      </w:r>
-      <w:r>
-        <w:rPr>
-          <w:b w:val="0"/>
-        </w:rPr>
-        <w:t xml:space="preserve"> and </w:t>
-      </w:r>
-      <w:r>
-        <w:rPr>
-          <w:rFonts w:ascii="Consolas" w:hAnsi="Consolas"/>
-          <w:b w:val="0"/>
-          <w:sz w:val="19"/>
-          <w:shd w:val="clear" w:color="auto" w:fill="E8ECF0"/>
-        </w:rPr>
-        <w:t>baseline_goldset.json</w:t>
-      </w:r>
-      <w:r>
-        <w:rPr>
-          <w:b w:val="0"/>
-        </w:rPr>
-        <w:t xml:space="preserve">. Add your </w:t>
-      </w:r>
-      <w:r>
-        <w:rPr>
-          <w:rFonts w:ascii="Consolas" w:hAnsi="Consolas"/>
-          <w:b w:val="0"/>
-          <w:sz w:val="19"/>
-          <w:shd w:val="clear" w:color="auto" w:fill="E8ECF0"/>
-        </w:rPr>
-        <w:t>my_kb/</w:t>
-      </w:r>
-      <w:r>
-        <w:rPr>
-          <w:b w:val="0"/>
-        </w:rPr>
-        <w:t xml:space="preserve"> folder, </w:t>
-      </w:r>
-      <w:r>
-        <w:rPr>
-          <w:rFonts w:ascii="Consolas" w:hAnsi="Consolas"/>
-          <w:b w:val="0"/>
-          <w:sz w:val="19"/>
-          <w:shd w:val="clear" w:color="auto" w:fill="E8ECF0"/>
-        </w:rPr>
-        <w:t>goldset.json</w:t>
-      </w:r>
-      <w:r>
-        <w:rPr>
-          <w:b w:val="0"/>
-        </w:rPr>
-        <w:t xml:space="preserve">, </w:t>
-      </w:r>
-      <w:r>
-        <w:rPr>
-          <w:rFonts w:ascii="Consolas" w:hAnsi="Consolas"/>
-          <w:b w:val="0"/>
-          <w:sz w:val="19"/>
-          <w:shd w:val="clear" w:color="auto" w:fill="E8ECF0"/>
-        </w:rPr>
-        <w:t>results.csv</w:t>
-      </w:r>
-      <w:r>
-        <w:rPr>
-          <w:b w:val="0"/>
-        </w:rPr>
-        <w:t xml:space="preserve"> and your chart.</w:t>
-      </w:r>
-    </w:p>
-    <w:p>
-      <w:pPr>
-        <w:tabs>
-          <w:tab w:pos="504" w:val="left"/>
-        </w:tabs>
-        <w:spacing w:before="0" w:after="80"/>
-        <w:ind w:left="504" w:hanging="360"/>
-      </w:pPr>
-      <w:r>
-        <w:t>3.</w:t>
-        <w:tab/>
-      </w:r>
-      <w:r>
-        <w:rPr>
-          <w:b w:val="0"/>
-        </w:rPr>
-        <w:t xml:space="preserve">The practice files now sit beside the notebook instead of two folders up, so change two lines. In Part 1, replace the </w:t>
-      </w:r>
-      <w:r>
-        <w:rPr>
-          <w:rFonts w:ascii="Consolas" w:hAnsi="Consolas"/>
-          <w:b w:val="0"/>
-          <w:sz w:val="19"/>
-          <w:shd w:val="clear" w:color="auto" w:fill="E8ECF0"/>
-        </w:rPr>
-        <w:t>COURSE_KB = ...</w:t>
-      </w:r>
-      <w:r>
-        <w:rPr>
-          <w:b w:val="0"/>
-        </w:rPr>
-        <w:t xml:space="preserve"> line with the one below. In the setup cell, set </w:t>
-      </w:r>
-      <w:r>
-        <w:rPr>
-          <w:rFonts w:ascii="Consolas" w:hAnsi="Consolas"/>
-          <w:b w:val="0"/>
-          <w:sz w:val="19"/>
-          <w:shd w:val="clear" w:color="auto" w:fill="E8ECF0"/>
-        </w:rPr>
-        <w:t>NEEDED</w:t>
-      </w:r>
-      <w:r>
-        <w:rPr>
-          <w:b w:val="0"/>
-        </w:rPr>
-        <w:t xml:space="preserve"> to the three file names, and on Colab point </w:t>
-      </w:r>
-      <w:r>
-        <w:rPr>
-          <w:rFonts w:ascii="Consolas" w:hAnsi="Consolas"/>
-          <w:b w:val="0"/>
-          <w:sz w:val="19"/>
-          <w:shd w:val="clear" w:color="auto" w:fill="E8ECF0"/>
-        </w:rPr>
-        <w:t>COLAB_FOLDER</w:t>
-      </w:r>
-      <w:r>
-        <w:rPr>
-          <w:b w:val="0"/>
-        </w:rPr>
-        <w:t xml:space="preserve"> at your </w:t>
-      </w:r>
-      <w:r>
-        <w:rPr>
-          <w:rFonts w:ascii="Consolas" w:hAnsi="Consolas"/>
-          <w:b w:val="0"/>
-          <w:sz w:val="19"/>
-          <w:shd w:val="clear" w:color="auto" w:fill="E8ECF0"/>
-        </w:rPr>
-        <w:t>rag_project</w:t>
-      </w:r>
-      <w:r>
-        <w:rPr>
-          <w:b w:val="0"/>
-        </w:rPr>
-        <w:t xml:space="preserve"> folder in Drive. </w:t>
-      </w:r>
-      <w:r>
-        <w:rPr>
-          <w:rFonts w:ascii="Consolas" w:hAnsi="Consolas"/>
-          <w:b w:val="0"/>
-          <w:sz w:val="19"/>
-          <w:shd w:val="clear" w:color="auto" w:fill="E8ECF0"/>
-        </w:rPr>
-        <w:t>baseline_goldset.json</w:t>
-      </w:r>
-      <w:r>
-        <w:rPr>
-          <w:b w:val="0"/>
-        </w:rPr>
-        <w:t xml:space="preserve"> needs no change: the notebook already looks for it beside itself.</w:t>
-      </w:r>
-    </w:p>
-    <w:tbl>
-      <w:tblPr>
-        <w:tblW w:type="auto" w:w="0"/>
-        <w:jc w:val="center"/>
-        <w:tblLook w:firstColumn="1" w:firstRow="1" w:lastColumn="0" w:lastRow="0" w:noHBand="0" w:noVBand="1" w:val="04A0"/>
-      </w:tblPr>
-      <w:tblGrid>
-        <w:gridCol w:w="9792"/>
-      </w:tblGrid>
-      <w:tr>
-        <w:tc>
-          <w:tcPr>
-            <w:tcW w:type="dxa" w:w="9792"/>
-            <w:shd w:val="clear" w:color="auto" w:fill="F3F5F7"/>
-            <w:tcBorders>
-              <w:top w:val="nil"/>
-              <w:left w:val="single" w:sz="36" w:color="0D1B2A"/>
-              <w:bottom w:val="nil"/>
-              <w:right w:val="nil"/>
-            </w:tcBorders>
-            <w:tcMar>
-              <w:top w:w="120" w:type="dxa"/>
-              <w:bottom w:w="120" w:type="dxa"/>
-              <w:left w:w="200" w:type="dxa"/>
-              <w:right w:w="200" w:type="dxa"/>
-            </w:tcMar>
-          </w:tcPr>
-          <w:p>
-            <w:pPr>
-              <w:spacing w:before="0" w:after="0" w:line="240" w:lineRule="auto"/>
-            </w:pPr>
-            <w:r>
-              <w:rPr>
-                <w:rFonts w:ascii="Consolas" w:hAnsi="Consolas"/>
-                <w:sz w:val="17"/>
-              </w:rPr>
-              <w:t>COURSE_KB = ["ssrf.txt", "cybersecurity_kb.md"]</w:t>
-            </w:r>
-            <w:r>
-              <w:br/>
-            </w:r>
-            <w:r>
-              <w:rPr>
-                <w:rFonts w:ascii="Consolas" w:hAnsi="Consolas"/>
-                <w:sz w:val="17"/>
-              </w:rPr>
-              <w:t># in the setup cell:</w:t>
-            </w:r>
-            <w:r>
-              <w:br/>
-            </w:r>
-            <w:r>
-              <w:rPr>
-                <w:rFonts w:ascii="Consolas" w:hAnsi="Consolas"/>
-                <w:sz w:val="17"/>
-              </w:rPr>
-              <w:t>NEEDED = ["ssrf.txt", "cybersecurity_kb.md", "baseline_goldset.json"]</w:t>
-            </w:r>
-          </w:p>
-        </w:tc>
-      </w:tr>
-    </w:tbl>
-    <w:p>
-      <w:pPr>
-        <w:spacing w:before="0" w:after="40"/>
-      </w:pPr>
-    </w:p>
-    <w:p>
-      <w:pPr>
-        <w:tabs>
-          <w:tab w:pos="504" w:val="left"/>
-        </w:tabs>
-        <w:spacing w:before="0" w:after="80"/>
-        <w:ind w:left="504" w:hanging="360"/>
-      </w:pPr>
-      <w:r>
-        <w:t>4.</w:t>
-        <w:tab/>
-      </w:r>
-      <w:r>
-        <w:rPr>
-          <w:b w:val="0"/>
-        </w:rPr>
-        <w:t xml:space="preserve">Choose </w:t>
-      </w:r>
-      <w:r>
-        <w:rPr>
-          <w:b/>
-        </w:rPr>
-        <w:t>Restart and run all</w:t>
-      </w:r>
-      <w:r>
-        <w:rPr>
-          <w:b w:val="0"/>
-        </w:rPr>
-        <w:t xml:space="preserve">, check that every cell ran, save the notebook, and commit and push it with its outputs. From Colab, the easiest way is </w:t>
-      </w:r>
-      <w:r>
-        <w:rPr>
-          <w:b/>
-        </w:rPr>
-        <w:t>File → Download → Download .ipynb</w:t>
-      </w:r>
-      <w:r>
-        <w:rPr>
-          <w:b w:val="0"/>
-        </w:rPr>
-        <w:t xml:space="preserve">, then </w:t>
-      </w:r>
-      <w:r>
-        <w:rPr>
-          <w:b/>
-        </w:rPr>
-        <w:t>Add file → Upload files</w:t>
-      </w:r>
-      <w:r>
-        <w:rPr>
-          <w:b w:val="0"/>
-        </w:rPr>
-        <w:t xml:space="preserve"> on your repository's GitHub page.</w:t>
-      </w:r>
-    </w:p>
-    <w:p>
-      <w:pPr>
-        <w:pStyle w:val="Heading2"/>
-        <w:keepNext/>
-        <w:pBdr>
-          <w:bottom w:val="single" w:sz="18" w:space="3" w:color="A3122A"/>
-        </w:pBdr>
-        <w:spacing w:before="280" w:after="120"/>
-      </w:pPr>
-      <w:r>
-        <w:rPr>
-          <w:b w:val="0"/>
-        </w:rPr>
-        <w:t>8. When something goes wrong</w:t>
+        <w:t>If something goes wrong</w:t>
       </w:r>
     </w:p>
     <w:tbl>
@@ -4339,7 +1016,7 @@
               <w:rPr>
                 <w:b w:val="0"/>
               </w:rPr>
-              <w:t xml:space="preserve">The packages are not in the Python the notebook is using. On Colab, run the setup cell (each new session starts empty). In VS Code or Jupyter, choose the </w:t>
+              <w:t xml:space="preserve">Run the install line from step 2. On Colab, run it again after every restart. In JupyterLab or VS Code, make sure it says </w:t>
             </w:r>
             <w:r>
               <w:rPr>
@@ -4348,13 +1025,13 @@
                 <w:sz w:val="19"/>
                 <w:shd w:val="clear" w:color="auto" w:fill="E8ECF0"/>
               </w:rPr>
-              <w:t>.venv</w:t>
+              <w:t>%pip</w:t>
             </w:r>
             <w:r>
               <w:rPr>
                 <w:b w:val="0"/>
               </w:rPr>
-              <w:t xml:space="preserve"> kernel, or activate </w:t>
+              <w:t xml:space="preserve">, not </w:t>
             </w:r>
             <w:r>
               <w:rPr>
@@ -4363,22 +1040,7 @@
                 <w:sz w:val="19"/>
                 <w:shd w:val="clear" w:color="auto" w:fill="E8ECF0"/>
               </w:rPr>
-              <w:t>.venv</w:t>
-            </w:r>
-            <w:r>
-              <w:rPr>
-                <w:b w:val="0"/>
-              </w:rPr>
-              <w:t xml:space="preserve"> before starting </w:t>
-            </w:r>
-            <w:r>
-              <w:rPr>
-                <w:rFonts w:ascii="Consolas" w:hAnsi="Consolas"/>
-                <w:b w:val="0"/>
-                <w:sz w:val="19"/>
-                <w:shd w:val="clear" w:color="auto" w:fill="E8ECF0"/>
-              </w:rPr>
-              <w:t>jupyter lab</w:t>
+              <w:t>!pip</w:t>
             </w:r>
             <w:r>
               <w:rPr>
@@ -4445,7 +1107,37 @@
               <w:rPr>
                 <w:b w:val="0"/>
               </w:rPr>
-              <w:t>The notebook is in the wrong folder. See step 6.</w:t>
+              <w:t xml:space="preserve">The notebook is not running from its own folder. On Colab, run the </w:t>
+            </w:r>
+            <w:r>
+              <w:rPr>
+                <w:rFonts w:ascii="Consolas" w:hAnsi="Consolas"/>
+                <w:b w:val="0"/>
+                <w:sz w:val="19"/>
+                <w:shd w:val="clear" w:color="auto" w:fill="E8ECF0"/>
+              </w:rPr>
+              <w:t>%cd</w:t>
+            </w:r>
+            <w:r>
+              <w:rPr>
+                <w:b w:val="0"/>
+              </w:rPr>
+              <w:t xml:space="preserve"> cell from step 1. Elsewhere, open the notebook inside your cloned </w:t>
+            </w:r>
+            <w:r>
+              <w:rPr>
+                <w:rFonts w:ascii="Consolas" w:hAnsi="Consolas"/>
+                <w:b w:val="0"/>
+                <w:sz w:val="19"/>
+                <w:shd w:val="clear" w:color="auto" w:fill="E8ECF0"/>
+              </w:rPr>
+              <w:t>IT7075</w:t>
+            </w:r>
+            <w:r>
+              <w:rPr>
+                <w:b w:val="0"/>
+              </w:rPr>
+              <w:t xml:space="preserve"> folder, not a downloaded copy.</w:t>
             </w:r>
           </w:p>
         </w:tc>
@@ -4539,7 +1231,22 @@
                 <w:sz w:val="19"/>
                 <w:shd w:val="clear" w:color="auto" w:fill="E8ECF0"/>
               </w:rPr>
-              <w:t>fatal: destination path 'IT7075' already exists</w:t>
+              <w:t>externally-managed-environment</w:t>
+            </w:r>
+            <w:r>
+              <w:rPr>
+                <w:b w:val="0"/>
+              </w:rPr>
+              <w:t xml:space="preserve"> when you run </w:t>
+            </w:r>
+            <w:r>
+              <w:rPr>
+                <w:rFonts w:ascii="Consolas" w:hAnsi="Consolas"/>
+                <w:b w:val="0"/>
+                <w:sz w:val="19"/>
+                <w:shd w:val="clear" w:color="auto" w:fill="E8ECF0"/>
+              </w:rPr>
+              <w:t>pip</w:t>
             </w:r>
           </w:p>
         </w:tc>
@@ -4567,7 +1274,7 @@
               <w:rPr>
                 <w:b w:val="0"/>
               </w:rPr>
-              <w:t xml:space="preserve">You have already cloned it. To get course updates, </w:t>
+              <w:t xml:space="preserve">Activate the </w:t>
             </w:r>
             <w:r>
               <w:rPr>
@@ -4576,13 +1283,13 @@
                 <w:sz w:val="19"/>
                 <w:shd w:val="clear" w:color="auto" w:fill="E8ECF0"/>
               </w:rPr>
-              <w:t>cd IT7075</w:t>
+              <w:t>.venv</w:t>
             </w:r>
             <w:r>
               <w:rPr>
                 <w:b w:val="0"/>
               </w:rPr>
-              <w:t xml:space="preserve"> and then </w:t>
+              <w:t xml:space="preserve"> first (</w:t>
             </w:r>
             <w:r>
               <w:rPr>
@@ -4591,125 +1298,13 @@
                 <w:sz w:val="19"/>
                 <w:shd w:val="clear" w:color="auto" w:fill="E8ECF0"/>
               </w:rPr>
-              <w:t>git pull</w:t>
+              <w:t>source .venv/bin/activate</w:t>
             </w:r>
             <w:r>
               <w:rPr>
                 <w:b w:val="0"/>
               </w:rPr>
-              <w:t>.</w:t>
-            </w:r>
-          </w:p>
-        </w:tc>
-      </w:tr>
-      <w:tr>
-        <w:tc>
-          <w:tcPr>
-            <w:tcW w:type="dxa" w:w="3525"/>
-            <w:tcBorders>
-              <w:top w:val="single" w:sz="4" w:color="C9D2DC"/>
-              <w:left w:val="single" w:sz="4" w:color="C9D2DC"/>
-              <w:bottom w:val="single" w:sz="4" w:color="C9D2DC"/>
-              <w:right w:val="single" w:sz="4" w:color="C9D2DC"/>
-            </w:tcBorders>
-            <w:tcMar>
-              <w:top w:w="60" w:type="dxa"/>
-              <w:bottom w:w="60" w:type="dxa"/>
-              <w:left w:w="110" w:type="dxa"/>
-              <w:right w:w="110" w:type="dxa"/>
-            </w:tcMar>
-          </w:tcPr>
-          <w:p>
-            <w:pPr>
-              <w:spacing w:before="0" w:after="0"/>
-            </w:pPr>
-            <w:r>
-              <w:rPr>
-                <w:rFonts w:ascii="Consolas" w:hAnsi="Consolas"/>
-                <w:b w:val="0"/>
-                <w:sz w:val="19"/>
-                <w:shd w:val="clear" w:color="auto" w:fill="E8ECF0"/>
-              </w:rPr>
-              <w:t>git pull</w:t>
-            </w:r>
-            <w:r>
-              <w:rPr>
-                <w:b w:val="0"/>
-              </w:rPr>
-              <w:t xml:space="preserve"> says your local changes would be overwritten</w:t>
-            </w:r>
-          </w:p>
-        </w:tc>
-        <w:tc>
-          <w:tcPr>
-            <w:tcW w:type="dxa" w:w="6267"/>
-            <w:tcBorders>
-              <w:top w:val="single" w:sz="4" w:color="C9D2DC"/>
-              <w:left w:val="single" w:sz="4" w:color="C9D2DC"/>
-              <w:bottom w:val="single" w:sz="4" w:color="C9D2DC"/>
-              <w:right w:val="single" w:sz="4" w:color="C9D2DC"/>
-            </w:tcBorders>
-            <w:tcMar>
-              <w:top w:w="60" w:type="dxa"/>
-              <w:bottom w:w="60" w:type="dxa"/>
-              <w:left w:w="110" w:type="dxa"/>
-              <w:right w:w="110" w:type="dxa"/>
-            </w:tcMar>
-          </w:tcPr>
-          <w:p>
-            <w:pPr>
-              <w:spacing w:before="0" w:after="0"/>
-            </w:pPr>
-            <w:r>
-              <w:rPr>
-                <w:b w:val="0"/>
-              </w:rPr>
-              <w:t xml:space="preserve">You edited a file that the instructor has since updated. Run </w:t>
-            </w:r>
-            <w:r>
-              <w:rPr>
-                <w:rFonts w:ascii="Consolas" w:hAnsi="Consolas"/>
-                <w:b w:val="0"/>
-                <w:sz w:val="19"/>
-                <w:shd w:val="clear" w:color="auto" w:fill="E8ECF0"/>
-              </w:rPr>
-              <w:t>git stash</w:t>
-            </w:r>
-            <w:r>
-              <w:rPr>
-                <w:b w:val="0"/>
-              </w:rPr>
-              <w:t xml:space="preserve">, then </w:t>
-            </w:r>
-            <w:r>
-              <w:rPr>
-                <w:rFonts w:ascii="Consolas" w:hAnsi="Consolas"/>
-                <w:b w:val="0"/>
-                <w:sz w:val="19"/>
-                <w:shd w:val="clear" w:color="auto" w:fill="E8ECF0"/>
-              </w:rPr>
-              <w:t>git pull</w:t>
-            </w:r>
-            <w:r>
-              <w:rPr>
-                <w:b w:val="0"/>
-              </w:rPr>
-              <w:t xml:space="preserve">, then </w:t>
-            </w:r>
-            <w:r>
-              <w:rPr>
-                <w:rFonts w:ascii="Consolas" w:hAnsi="Consolas"/>
-                <w:b w:val="0"/>
-                <w:sz w:val="19"/>
-                <w:shd w:val="clear" w:color="auto" w:fill="E8ECF0"/>
-              </w:rPr>
-              <w:t>git stash pop</w:t>
-            </w:r>
-            <w:r>
-              <w:rPr>
-                <w:b w:val="0"/>
-              </w:rPr>
-              <w:t xml:space="preserve"> to keep both versions.</w:t>
+              <w:t>).</w:t>
             </w:r>
           </w:p>
         </w:tc>
@@ -4801,285 +1396,6 @@
                 <w:b w:val="0"/>
               </w:rPr>
               <w:t xml:space="preserve">, then create the </w:t>
-            </w:r>
-            <w:r>
-              <w:rPr>
-                <w:rFonts w:ascii="Consolas" w:hAnsi="Consolas"/>
-                <w:b w:val="0"/>
-                <w:sz w:val="19"/>
-                <w:shd w:val="clear" w:color="auto" w:fill="E8ECF0"/>
-              </w:rPr>
-              <w:t>.venv</w:t>
-            </w:r>
-            <w:r>
-              <w:rPr>
-                <w:b w:val="0"/>
-              </w:rPr>
-              <w:t xml:space="preserve"> again.</w:t>
-            </w:r>
-          </w:p>
-        </w:tc>
-      </w:tr>
-      <w:tr>
-        <w:tc>
-          <w:tcPr>
-            <w:tcW w:type="dxa" w:w="3525"/>
-            <w:tcBorders>
-              <w:top w:val="single" w:sz="4" w:color="C9D2DC"/>
-              <w:left w:val="single" w:sz="4" w:color="C9D2DC"/>
-              <w:bottom w:val="single" w:sz="4" w:color="C9D2DC"/>
-              <w:right w:val="single" w:sz="4" w:color="C9D2DC"/>
-            </w:tcBorders>
-            <w:tcMar>
-              <w:top w:w="60" w:type="dxa"/>
-              <w:bottom w:w="60" w:type="dxa"/>
-              <w:left w:w="110" w:type="dxa"/>
-              <w:right w:w="110" w:type="dxa"/>
-            </w:tcMar>
-          </w:tcPr>
-          <w:p>
-            <w:pPr>
-              <w:spacing w:before="0" w:after="0"/>
-            </w:pPr>
-            <w:r>
-              <w:rPr>
-                <w:rFonts w:ascii="Consolas" w:hAnsi="Consolas"/>
-                <w:b w:val="0"/>
-                <w:sz w:val="19"/>
-                <w:shd w:val="clear" w:color="auto" w:fill="E8ECF0"/>
-              </w:rPr>
-              <w:t>torch.cuda.is_available()</w:t>
-            </w:r>
-            <w:r>
-              <w:rPr>
-                <w:b w:val="0"/>
-              </w:rPr>
-              <w:t xml:space="preserve"> is </w:t>
-            </w:r>
-            <w:r>
-              <w:rPr>
-                <w:rFonts w:ascii="Consolas" w:hAnsi="Consolas"/>
-                <w:b w:val="0"/>
-                <w:sz w:val="19"/>
-                <w:shd w:val="clear" w:color="auto" w:fill="E8ECF0"/>
-              </w:rPr>
-              <w:t>False</w:t>
-            </w:r>
-            <w:r>
-              <w:rPr>
-                <w:b w:val="0"/>
-              </w:rPr>
-              <w:t xml:space="preserve"> on Jetstream2</w:t>
-            </w:r>
-          </w:p>
-        </w:tc>
-        <w:tc>
-          <w:tcPr>
-            <w:tcW w:type="dxa" w:w="6267"/>
-            <w:tcBorders>
-              <w:top w:val="single" w:sz="4" w:color="C9D2DC"/>
-              <w:left w:val="single" w:sz="4" w:color="C9D2DC"/>
-              <w:bottom w:val="single" w:sz="4" w:color="C9D2DC"/>
-              <w:right w:val="single" w:sz="4" w:color="C9D2DC"/>
-            </w:tcBorders>
-            <w:tcMar>
-              <w:top w:w="60" w:type="dxa"/>
-              <w:bottom w:w="60" w:type="dxa"/>
-              <w:left w:w="110" w:type="dxa"/>
-              <w:right w:w="110" w:type="dxa"/>
-            </w:tcMar>
-          </w:tcPr>
-          <w:p>
-            <w:pPr>
-              <w:spacing w:before="0" w:after="0"/>
-            </w:pPr>
-            <w:r>
-              <w:rPr>
-                <w:b w:val="0"/>
-              </w:rPr>
-              <w:t xml:space="preserve">Run the </w:t>
-            </w:r>
-            <w:r>
-              <w:rPr>
-                <w:rFonts w:ascii="Consolas" w:hAnsi="Consolas"/>
-                <w:b w:val="0"/>
-                <w:sz w:val="19"/>
-                <w:shd w:val="clear" w:color="auto" w:fill="E8ECF0"/>
-              </w:rPr>
-              <w:t>cu121</w:t>
-            </w:r>
-            <w:r>
-              <w:rPr>
-                <w:b w:val="0"/>
-              </w:rPr>
-              <w:t xml:space="preserve"> torch command from step 4 again.</w:t>
-            </w:r>
-          </w:p>
-        </w:tc>
-      </w:tr>
-      <w:tr>
-        <w:tc>
-          <w:tcPr>
-            <w:tcW w:type="dxa" w:w="3525"/>
-            <w:tcBorders>
-              <w:top w:val="single" w:sz="4" w:color="C9D2DC"/>
-              <w:left w:val="single" w:sz="4" w:color="C9D2DC"/>
-              <w:bottom w:val="single" w:sz="4" w:color="C9D2DC"/>
-              <w:right w:val="single" w:sz="4" w:color="C9D2DC"/>
-            </w:tcBorders>
-            <w:tcMar>
-              <w:top w:w="60" w:type="dxa"/>
-              <w:bottom w:w="60" w:type="dxa"/>
-              <w:left w:w="110" w:type="dxa"/>
-              <w:right w:w="110" w:type="dxa"/>
-            </w:tcMar>
-          </w:tcPr>
-          <w:p>
-            <w:pPr>
-              <w:spacing w:before="0" w:after="0"/>
-            </w:pPr>
-            <w:r>
-              <w:rPr>
-                <w:rFonts w:ascii="Consolas" w:hAnsi="Consolas"/>
-                <w:b w:val="0"/>
-                <w:sz w:val="19"/>
-                <w:shd w:val="clear" w:color="auto" w:fill="E8ECF0"/>
-              </w:rPr>
-              <w:t>No space left on device</w:t>
-            </w:r>
-          </w:p>
-        </w:tc>
-        <w:tc>
-          <w:tcPr>
-            <w:tcW w:type="dxa" w:w="6267"/>
-            <w:tcBorders>
-              <w:top w:val="single" w:sz="4" w:color="C9D2DC"/>
-              <w:left w:val="single" w:sz="4" w:color="C9D2DC"/>
-              <w:bottom w:val="single" w:sz="4" w:color="C9D2DC"/>
-              <w:right w:val="single" w:sz="4" w:color="C9D2DC"/>
-            </w:tcBorders>
-            <w:tcMar>
-              <w:top w:w="60" w:type="dxa"/>
-              <w:bottom w:w="60" w:type="dxa"/>
-              <w:left w:w="110" w:type="dxa"/>
-              <w:right w:w="110" w:type="dxa"/>
-            </w:tcMar>
-          </w:tcPr>
-          <w:p>
-            <w:pPr>
-              <w:spacing w:before="0" w:after="0"/>
-            </w:pPr>
-            <w:r>
-              <w:rPr>
-                <w:rFonts w:ascii="Consolas" w:hAnsi="Consolas"/>
-                <w:b w:val="0"/>
-                <w:sz w:val="19"/>
-                <w:shd w:val="clear" w:color="auto" w:fill="E8ECF0"/>
-              </w:rPr>
-              <w:t>df -h ~</w:t>
-            </w:r>
-            <w:r>
-              <w:rPr>
-                <w:b w:val="0"/>
-              </w:rPr>
-              <w:t xml:space="preserve"> shows how much space is free, and </w:t>
-            </w:r>
-            <w:r>
-              <w:rPr>
-                <w:rFonts w:ascii="Consolas" w:hAnsi="Consolas"/>
-                <w:b w:val="0"/>
-                <w:sz w:val="19"/>
-                <w:shd w:val="clear" w:color="auto" w:fill="E8ECF0"/>
-              </w:rPr>
-              <w:t>pip cache purge</w:t>
-            </w:r>
-            <w:r>
-              <w:rPr>
-                <w:b w:val="0"/>
-              </w:rPr>
-              <w:t xml:space="preserve"> clears pip's download cache.</w:t>
-            </w:r>
-          </w:p>
-        </w:tc>
-      </w:tr>
-      <w:tr>
-        <w:tc>
-          <w:tcPr>
-            <w:tcW w:type="dxa" w:w="3525"/>
-            <w:tcBorders>
-              <w:top w:val="single" w:sz="4" w:color="C9D2DC"/>
-              <w:left w:val="single" w:sz="4" w:color="C9D2DC"/>
-              <w:bottom w:val="single" w:sz="4" w:color="C9D2DC"/>
-              <w:right w:val="single" w:sz="4" w:color="C9D2DC"/>
-            </w:tcBorders>
-            <w:tcMar>
-              <w:top w:w="60" w:type="dxa"/>
-              <w:bottom w:w="60" w:type="dxa"/>
-              <w:left w:w="110" w:type="dxa"/>
-              <w:right w:w="110" w:type="dxa"/>
-            </w:tcMar>
-          </w:tcPr>
-          <w:p>
-            <w:pPr>
-              <w:spacing w:before="0" w:after="0"/>
-            </w:pPr>
-            <w:r>
-              <w:rPr>
-                <w:b w:val="0"/>
-              </w:rPr>
-              <w:t xml:space="preserve">Windows: </w:t>
-            </w:r>
-            <w:r>
-              <w:rPr>
-                <w:rFonts w:ascii="Consolas" w:hAnsi="Consolas"/>
-                <w:b w:val="0"/>
-                <w:sz w:val="19"/>
-                <w:shd w:val="clear" w:color="auto" w:fill="E8ECF0"/>
-              </w:rPr>
-              <w:t>running scripts is disabled on this system</w:t>
-            </w:r>
-          </w:p>
-        </w:tc>
-        <w:tc>
-          <w:tcPr>
-            <w:tcW w:type="dxa" w:w="6267"/>
-            <w:tcBorders>
-              <w:top w:val="single" w:sz="4" w:color="C9D2DC"/>
-              <w:left w:val="single" w:sz="4" w:color="C9D2DC"/>
-              <w:bottom w:val="single" w:sz="4" w:color="C9D2DC"/>
-              <w:right w:val="single" w:sz="4" w:color="C9D2DC"/>
-            </w:tcBorders>
-            <w:tcMar>
-              <w:top w:w="60" w:type="dxa"/>
-              <w:bottom w:w="60" w:type="dxa"/>
-              <w:left w:w="110" w:type="dxa"/>
-              <w:right w:w="110" w:type="dxa"/>
-            </w:tcMar>
-          </w:tcPr>
-          <w:p>
-            <w:pPr>
-              <w:spacing w:before="0" w:after="0"/>
-            </w:pPr>
-            <w:r>
-              <w:rPr>
-                <w:b w:val="0"/>
-              </w:rPr>
-              <w:t xml:space="preserve">Run </w:t>
-            </w:r>
-            <w:r>
-              <w:rPr>
-                <w:rFonts w:ascii="Consolas" w:hAnsi="Consolas"/>
-                <w:b w:val="0"/>
-                <w:sz w:val="19"/>
-                <w:shd w:val="clear" w:color="auto" w:fill="E8ECF0"/>
-              </w:rPr>
-              <w:t>Set-ExecutionPolicy -Scope CurrentUser RemoteSigned</w:t>
-            </w:r>
-            <w:r>
-              <w:rPr>
-                <w:b w:val="0"/>
-              </w:rPr>
-              <w:t xml:space="preserve"> once, then activate </w:t>
             </w:r>
             <w:r>
               <w:rPr>

</xml_diff>